<commit_message>
Actualización Bitacora de uso de IA
</commit_message>
<xml_diff>
--- a/Trabajo Farmacia/04-Evidencias/Bitacora_Uso_IA.docx
+++ b/Trabajo Farmacia/04-Evidencias/Bitacora_Uso_IA.docx
@@ -1,64 +1,255 @@
 
 <file path=word/document.xml><?xml version="1.0" encoding="utf-8"?>
-<w:document xmlns:wpc="http://schemas.microsoft.com/office/word/2010/wordprocessingCanvas" xmlns:cx="http://schemas.microsoft.com/office/drawing/2014/chartex" xmlns:cx1="http://schemas.microsoft.com/office/drawing/2015/9/8/chartex" xmlns:cx2="http://schemas.microsoft.com/office/drawing/2015/10/21/chartex" xmlns:cx3="http://schemas.microsoft.com/office/drawing/2016/5/9/chartex" xmlns:cx4="http://schemas.microsoft.com/office/drawing/2016/5/10/chartex" xmlns:cx5="http://schemas.microsoft.com/office/drawing/2016/5/11/chartex" xmlns:cx6="http://schemas.microsoft.com/office/drawing/2016/5/12/chartex" xmlns:cx7="http://schemas.microsoft.com/office/drawing/2016/5/13/chartex" xmlns:cx8="http://schemas.microsoft.com/office/drawing/2016/5/14/chartex" xmlns:mc="http://schemas.openxmlformats.org/markup-compatibility/2006" xmlns:aink="http://schemas.microsoft.com/office/drawing/2016/ink" xmlns:am3d="http://schemas.microsoft.com/office/drawing/2017/model3d" xmlns:o="urn:schemas-microsoft-com:office:office" xmlns:oel="http://schemas.microsoft.com/office/2019/extlst" xmlns:r="http://schemas.openxmlformats.org/officeDocument/2006/relationships" xmlns:m="http://schemas.openxmlformats.org/officeDocument/2006/math" xmlns:v="urn:schemas-microsoft-com:vml" xmlns:wp14="http://schemas.microsoft.com/office/word/2010/wordprocessingDrawing" xmlns:wp="http://schemas.openxmlformats.org/drawingml/2006/wordprocessingDrawing" xmlns:w10="urn:schemas-microsoft-com:office:word" xmlns:w="http://schemas.openxmlformats.org/wordprocessingml/2006/main" xmlns:w14="http://schemas.microsoft.com/office/word/2010/wordml" xmlns:w15="http://schemas.microsoft.com/office/word/2012/wordml" xmlns:w16cei="http://schemas.microsoft.com/office/word/2026/wordml/cei" xmlns:w16cex="http://schemas.microsoft.com/office/word/2018/wordml/cex" xmlns:w16cid="http://schemas.microsoft.com/office/word/2016/wordml/cid" xmlns:w16="http://schemas.microsoft.com/office/word/2018/wordml" xmlns:w16du="http://schemas.microsoft.com/office/word/2023/wordml/word16du" xmlns:w16sdtdh="http://schemas.microsoft.com/office/word/2020/wordml/sdtdatahash" xmlns:w16sdtfl="http://schemas.microsoft.com/office/word/2024/wordml/sdtformatlock" xmlns:w16se="http://schemas.microsoft.com/office/word/2015/wordml/symex" xmlns:wpg="http://schemas.microsoft.com/office/word/2010/wordprocessingGroup" xmlns:wpi="http://schemas.microsoft.com/office/word/2010/wordprocessingInk" xmlns:wne="http://schemas.microsoft.com/office/word/2006/wordml" xmlns:wps="http://schemas.microsoft.com/office/word/2010/wordprocessingShape" mc:Ignorable="w14 w15 w16se w16cid w16 w16cex w16sdtdh w16sdtfl w16du wp14">
+<w:document xmlns:wpc="http://schemas.microsoft.com/office/word/2010/wordprocessingCanvas" xmlns:cx="http://schemas.microsoft.com/office/drawing/2014/chartex" xmlns:cx1="http://schemas.microsoft.com/office/drawing/2015/9/8/chartex" xmlns:cx2="http://schemas.microsoft.com/office/drawing/2015/10/21/chartex" xmlns:cx3="http://schemas.microsoft.com/office/drawing/2016/5/9/chartex" xmlns:cx4="http://schemas.microsoft.com/office/drawing/2016/5/10/chartex" xmlns:cx5="http://schemas.microsoft.com/office/drawing/2016/5/11/chartex" xmlns:cx6="http://schemas.microsoft.com/office/drawing/2016/5/12/chartex" xmlns:cx7="http://schemas.microsoft.com/office/drawing/2016/5/13/chartex" xmlns:cx8="http://schemas.microsoft.com/office/drawing/2016/5/14/chartex" xmlns:mc="http://schemas.openxmlformats.org/markup-compatibility/2006" xmlns:aink="http://schemas.microsoft.com/office/drawing/2016/ink" xmlns:am3d="http://schemas.microsoft.com/office/drawing/2017/model3d" xmlns:o="urn:schemas-microsoft-com:office:office" xmlns:oel="http://schemas.microsoft.com/office/2019/extlst" xmlns:r="http://schemas.openxmlformats.org/officeDocument/2006/relationships" xmlns:m="http://schemas.openxmlformats.org/officeDocument/2006/math" xmlns:v="urn:schemas-microsoft-com:vml" xmlns:wp14="http://schemas.microsoft.com/office/word/2010/wordprocessingDrawing" xmlns:wp="http://schemas.openxmlformats.org/drawingml/2006/wordprocessingDrawing" xmlns:w10="urn:schemas-microsoft-com:office:word" xmlns:w="http://schemas.openxmlformats.org/wordprocessingml/2006/main" xmlns:w14="http://schemas.microsoft.com/office/word/2010/wordml" xmlns:w15="http://schemas.microsoft.com/office/word/2012/wordml" xmlns:w16cex="http://schemas.microsoft.com/office/word/2018/wordml/cex" xmlns:w16cid="http://schemas.microsoft.com/office/word/2016/wordml/cid" xmlns:w16="http://schemas.microsoft.com/office/word/2018/wordml" xmlns:w16du="http://schemas.microsoft.com/office/word/2023/wordml/word16du" xmlns:w16sdtdh="http://schemas.microsoft.com/office/word/2020/wordml/sdtdatahash" xmlns:w16sdtfl="http://schemas.microsoft.com/office/word/2024/wordml/sdtformatlock" xmlns:w16se="http://schemas.microsoft.com/office/word/2015/wordml/symex" xmlns:wpg="http://schemas.microsoft.com/office/word/2010/wordprocessingGroup" xmlns:wpi="http://schemas.microsoft.com/office/word/2010/wordprocessingInk" xmlns:wne="http://schemas.microsoft.com/office/word/2006/wordml" xmlns:wps="http://schemas.microsoft.com/office/word/2010/wordprocessingShape" mc:Ignorable="w14 w15 w16se w16cid w16 w16cex w16sdtdh w16sdtfl w16du wp14">
   <w:body>
     <w:p>
       <w:pPr>
-        <w:pStyle w:val="Ttulo1"/>
+        <w:pStyle w:val="Textodebloque"/>
+        <w:ind w:left="0"/>
+        <w:rPr>
+          <w:rFonts w:asciiTheme="majorHAnsi" w:eastAsiaTheme="majorEastAsia" w:hAnsiTheme="majorHAnsi" w:cstheme="majorBidi"/>
+          <w:b/>
+          <w:bCs/>
+          <w:color w:val="0F9ED5" w:themeColor="accent4"/>
+          <w:sz w:val="44"/>
+          <w:szCs w:val="44"/>
+          <w:lang w:val="es-CO"/>
+        </w:rPr>
       </w:pPr>
       <w:bookmarkStart w:id="0" w:name="bitácora-de-uso-de-ia"/>
       <w:r>
+        <w:rPr>
+          <w:rFonts w:asciiTheme="majorHAnsi" w:eastAsiaTheme="majorEastAsia" w:hAnsiTheme="majorHAnsi" w:cstheme="majorBidi"/>
+          <w:b/>
+          <w:bCs/>
+          <w:color w:val="0F9ED5" w:themeColor="accent4"/>
+          <w:sz w:val="44"/>
+          <w:szCs w:val="44"/>
+          <w:lang w:val="es-CO"/>
+        </w:rPr>
         <w:t>Bitácora de uso de IA</w:t>
       </w:r>
+      <w:bookmarkStart w:id="1" w:name="herramienta-y-regla-de-uso"/>
     </w:p>
     <w:p>
       <w:pPr>
         <w:pStyle w:val="Textodebloque"/>
+        <w:ind w:left="0"/>
+        <w:rPr>
+          <w:rFonts w:asciiTheme="majorHAnsi" w:eastAsiaTheme="majorEastAsia" w:hAnsiTheme="majorHAnsi" w:cstheme="majorBidi"/>
+          <w:b/>
+          <w:bCs/>
+          <w:color w:val="0F4761" w:themeColor="accent1" w:themeShade="BF"/>
+          <w:sz w:val="44"/>
+          <w:szCs w:val="44"/>
+          <w:lang w:val="es-CO"/>
+        </w:rPr>
       </w:pPr>
-      <w:r>
-        <w:t>Entregable exigido por la Fase 4. Su ausencia califica el criterio 6 en 0.0 (sección 10 de la rúbrica). Se evalúa la calidad del juicio, no la cantidad de registros.</w:t>
-      </w:r>
     </w:p>
     <w:p>
       <w:pPr>
-        <w:pStyle w:val="Ttulo2"/>
+        <w:pStyle w:val="Textodebloque"/>
+        <w:ind w:left="0"/>
+        <w:rPr>
+          <w:rFonts w:asciiTheme="majorHAnsi" w:eastAsiaTheme="majorEastAsia" w:hAnsiTheme="majorHAnsi" w:cstheme="majorBidi"/>
+          <w:b/>
+          <w:bCs/>
+          <w:color w:val="0F4761" w:themeColor="accent1" w:themeShade="BF"/>
+          <w:sz w:val="44"/>
+          <w:szCs w:val="44"/>
+          <w:lang w:val="es-CO"/>
+        </w:rPr>
       </w:pPr>
-      <w:bookmarkStart w:id="1" w:name="herramienta-y-regla-de-uso"/>
       <w:r>
+        <w:rPr>
+          <w:b/>
+          <w:bCs/>
+          <w:lang w:val="es-CO"/>
+        </w:rPr>
         <w:t>Herramienta y regla de uso</w:t>
       </w:r>
     </w:p>
     <w:p>
       <w:pPr>
         <w:pStyle w:val="FirstParagraph"/>
+        <w:rPr>
+          <w:lang w:val="es-CO"/>
+        </w:rPr>
       </w:pPr>
       <w:r>
-        <w:t>Trabajamos con GitHub Copilot en Visual Studio Code, con el agente personalizado “Arquitectura” y sus skills SOLID, y con asistentes de línea de comandos para el análisis del código y la generación de los diagramas.</w:t>
+        <w:rPr>
+          <w:lang w:val="es-CO"/>
+        </w:rPr>
+        <w:t xml:space="preserve">Trabajamos con GitHub </w:t>
+      </w:r>
+      <w:proofErr w:type="spellStart"/>
+      <w:r>
+        <w:rPr>
+          <w:lang w:val="es-CO"/>
+        </w:rPr>
+        <w:t>Copilot</w:t>
+      </w:r>
+      <w:proofErr w:type="spellEnd"/>
+      <w:r>
+        <w:rPr>
+          <w:lang w:val="es-CO"/>
+        </w:rPr>
+        <w:t xml:space="preserve"> en Visual Studio </w:t>
+      </w:r>
+      <w:proofErr w:type="spellStart"/>
+      <w:r>
+        <w:rPr>
+          <w:lang w:val="es-CO"/>
+        </w:rPr>
+        <w:t>Code</w:t>
+      </w:r>
+      <w:proofErr w:type="spellEnd"/>
+      <w:r>
+        <w:rPr>
+          <w:lang w:val="es-CO"/>
+        </w:rPr>
+        <w:t xml:space="preserve">, con el agente personalizado “Arquitectura” y </w:t>
+      </w:r>
+      <w:r>
+        <w:rPr>
+          <w:lang w:val="es-CO"/>
+        </w:rPr>
+        <w:t>las</w:t>
+      </w:r>
+      <w:r>
+        <w:rPr>
+          <w:lang w:val="es-CO"/>
+        </w:rPr>
+        <w:t xml:space="preserve"> </w:t>
+      </w:r>
+      <w:proofErr w:type="spellStart"/>
+      <w:r>
+        <w:rPr>
+          <w:lang w:val="es-CO"/>
+        </w:rPr>
+        <w:t>skills</w:t>
+      </w:r>
+      <w:proofErr w:type="spellEnd"/>
+      <w:r>
+        <w:rPr>
+          <w:lang w:val="es-CO"/>
+        </w:rPr>
+        <w:t xml:space="preserve"> SOLID, con asistentes de línea de comandos para el análisis del código y </w:t>
+      </w:r>
+      <w:r>
+        <w:rPr>
+          <w:lang w:val="es-CO"/>
+        </w:rPr>
+        <w:t>apoyo en el diseño</w:t>
+      </w:r>
+      <w:r>
+        <w:rPr>
+          <w:lang w:val="es-CO"/>
+        </w:rPr>
+        <w:t xml:space="preserve"> de los diagramas.</w:t>
       </w:r>
     </w:p>
     <w:p>
       <w:pPr>
         <w:pStyle w:val="Textoindependiente"/>
+        <w:rPr>
+          <w:lang w:val="es-CO"/>
+        </w:rPr>
       </w:pPr>
       <w:r>
-        <w:t>La regla que nos pusimos desde el principio fue simple: primero se lee y se entiende el código, y después se le pregunta a la herramienta. Ninguna propuesta suya se aceptó sin verificarla contra el código; las que no resistían la verificación se rechazaron con argumento por escrito. No fue un proceso de aceptar casi todo: de doce propuestas, siete terminaron rechazadas o corregidas.</w:t>
+        <w:rPr>
+          <w:lang w:val="es-CO"/>
+        </w:rPr>
+        <w:t xml:space="preserve">La regla que nos pusimos desde el principio fue simple: primero se lee y se entiende el código, y después se le pregunta a la herramienta. Ninguna propuesta suya se aceptó sin verificarla contra el código; las que no resistían la verificación se rechazaron con argumento por escrito. No fue un proceso de aceptar casi todo: de </w:t>
+      </w:r>
+      <w:r>
+        <w:rPr>
+          <w:lang w:val="es-CO"/>
+        </w:rPr>
+        <w:t>trece</w:t>
+      </w:r>
+      <w:r>
+        <w:rPr>
+          <w:lang w:val="es-CO"/>
+        </w:rPr>
+        <w:t xml:space="preserve"> propuestas, </w:t>
+      </w:r>
+      <w:r>
+        <w:rPr>
+          <w:lang w:val="es-CO"/>
+        </w:rPr>
+        <w:t>ocho</w:t>
+      </w:r>
+      <w:r>
+        <w:rPr>
+          <w:lang w:val="es-CO"/>
+        </w:rPr>
+        <w:t xml:space="preserve"> terminaron rechazadas o corregidas</w:t>
+      </w:r>
+      <w:bookmarkStart w:id="2" w:name="Xc24ba6b41eb3b1e341f44b95f37df9839895fbe"/>
+      <w:bookmarkEnd w:id="1"/>
+      <w:r>
+        <w:rPr>
+          <w:lang w:val="es-CO"/>
+        </w:rPr>
+        <w:t>.</w:t>
       </w:r>
     </w:p>
     <w:p>
       <w:pPr>
-        <w:pStyle w:val="Ttulo2"/>
+        <w:pStyle w:val="Textoindependiente"/>
+        <w:rPr>
+          <w:color w:val="0F9ED5" w:themeColor="accent4"/>
+          <w:lang w:val="es-CO"/>
+        </w:rPr>
       </w:pPr>
-      <w:bookmarkStart w:id="2" w:name="Xc24ba6b41eb3b1e341f44b95f37df9839895fbe"/>
-      <w:bookmarkEnd w:id="1"/>
+    </w:p>
+    <w:p>
+      <w:pPr>
+        <w:pStyle w:val="Textoindependiente"/>
+        <w:rPr>
+          <w:b/>
+          <w:bCs/>
+          <w:color w:val="0F9ED5" w:themeColor="accent4"/>
+          <w:sz w:val="32"/>
+          <w:szCs w:val="32"/>
+          <w:lang w:val="es-CO"/>
+        </w:rPr>
+      </w:pPr>
       <w:r>
-        <w:t>T1. Propuestas de la herramienta y decisiones del equipo</w:t>
+        <w:rPr>
+          <w:b/>
+          <w:bCs/>
+          <w:color w:val="0F9ED5" w:themeColor="accent4"/>
+          <w:sz w:val="32"/>
+          <w:szCs w:val="32"/>
+          <w:lang w:val="es-CO"/>
+        </w:rPr>
+        <w:t>Propuestas de la herramienta y decisiones del equipo</w:t>
+      </w:r>
+      <w:r>
+        <w:rPr>
+          <w:b/>
+          <w:bCs/>
+          <w:color w:val="0F9ED5" w:themeColor="accent4"/>
+          <w:sz w:val="32"/>
+          <w:szCs w:val="32"/>
+          <w:lang w:val="es-CO"/>
+        </w:rPr>
+        <w:t>:</w:t>
       </w:r>
     </w:p>
     <w:p>
       <w:pPr>
         <w:pStyle w:val="FirstParagraph"/>
+        <w:rPr>
+          <w:lang w:val="es-CO"/>
+        </w:rPr>
       </w:pPr>
       <w:r>
+        <w:rPr>
+          <w:lang w:val="es-CO"/>
+        </w:rPr>
         <w:t>Cada fila es una propuesta concreta de la herramienta y lo que el equipo hizo con ella.</w:t>
       </w:r>
     </w:p>
@@ -78,10 +269,10 @@
         <w:tblLook w:val="0020" w:firstRow="1" w:lastRow="0" w:firstColumn="0" w:lastColumn="0" w:noHBand="0" w:noVBand="0"/>
       </w:tblPr>
       <w:tblGrid>
-        <w:gridCol w:w="2263"/>
-        <w:gridCol w:w="2263"/>
-        <w:gridCol w:w="2264"/>
-        <w:gridCol w:w="2264"/>
+        <w:gridCol w:w="2207"/>
+        <w:gridCol w:w="2207"/>
+        <w:gridCol w:w="2207"/>
+        <w:gridCol w:w="2207"/>
       </w:tblGrid>
       <w:tr>
         <w:trPr>
@@ -90,7 +281,7 @@
         </w:trPr>
         <w:tc>
           <w:tcPr>
-            <w:tcW w:w="1980" w:type="dxa"/>
+            <w:tcW w:w="2263" w:type="dxa"/>
             <w:tcBorders>
               <w:bottom w:val="none" w:sz="0" w:space="0" w:color="auto"/>
             </w:tcBorders>
@@ -98,12 +289,15 @@
           <w:p>
             <w:pPr>
               <w:pStyle w:val="Compact"/>
-            </w:pPr>
-          </w:p>
-        </w:tc>
-        <w:tc>
-          <w:tcPr>
-            <w:tcW w:w="1980" w:type="dxa"/>
+              <w:rPr>
+                <w:lang w:val="es-CO"/>
+              </w:rPr>
+            </w:pPr>
+          </w:p>
+        </w:tc>
+        <w:tc>
+          <w:tcPr>
+            <w:tcW w:w="2263" w:type="dxa"/>
             <w:tcBorders>
               <w:bottom w:val="none" w:sz="0" w:space="0" w:color="auto"/>
             </w:tcBorders>
@@ -112,14 +306,32 @@
             <w:pPr>
               <w:pStyle w:val="Compact"/>
             </w:pPr>
-            <w:r>
-              <w:t>Qué propuso la herramienta</w:t>
-            </w:r>
-          </w:p>
-        </w:tc>
-        <w:tc>
-          <w:tcPr>
-            <w:tcW w:w="1980" w:type="dxa"/>
+            <w:proofErr w:type="spellStart"/>
+            <w:r>
+              <w:t>Qué</w:t>
+            </w:r>
+            <w:proofErr w:type="spellEnd"/>
+            <w:r>
+              <w:t xml:space="preserve"> </w:t>
+            </w:r>
+            <w:proofErr w:type="spellStart"/>
+            <w:r>
+              <w:t>propuso</w:t>
+            </w:r>
+            <w:proofErr w:type="spellEnd"/>
+            <w:r>
+              <w:t xml:space="preserve"> la </w:t>
+            </w:r>
+            <w:proofErr w:type="spellStart"/>
+            <w:r>
+              <w:t>herramienta</w:t>
+            </w:r>
+            <w:proofErr w:type="spellEnd"/>
+          </w:p>
+        </w:tc>
+        <w:tc>
+          <w:tcPr>
+            <w:tcW w:w="2264" w:type="dxa"/>
             <w:tcBorders>
               <w:bottom w:val="none" w:sz="0" w:space="0" w:color="auto"/>
             </w:tcBorders>
@@ -135,7 +347,7 @@
         </w:tc>
         <w:tc>
           <w:tcPr>
-            <w:tcW w:w="1980" w:type="dxa"/>
+            <w:tcW w:w="2264" w:type="dxa"/>
             <w:tcBorders>
               <w:bottom w:val="none" w:sz="0" w:space="0" w:color="auto"/>
             </w:tcBorders>
@@ -153,7 +365,7 @@
       <w:tr>
         <w:tc>
           <w:tcPr>
-            <w:tcW w:w="1980" w:type="dxa"/>
+            <w:tcW w:w="2263" w:type="dxa"/>
           </w:tcPr>
           <w:p>
             <w:pPr>
@@ -166,43 +378,62 @@
         </w:tc>
         <w:tc>
           <w:tcPr>
-            <w:tcW w:w="1980" w:type="dxa"/>
-          </w:tcPr>
-          <w:p>
-            <w:pPr>
-              <w:pStyle w:val="Compact"/>
-            </w:pPr>
-            <w:r>
+            <w:tcW w:w="2263" w:type="dxa"/>
+          </w:tcPr>
+          <w:p>
+            <w:pPr>
+              <w:pStyle w:val="Compact"/>
+              <w:rPr>
+                <w:lang w:val="es-CO"/>
+              </w:rPr>
+            </w:pPr>
+            <w:r>
+              <w:rPr>
+                <w:lang w:val="es-CO"/>
+              </w:rPr>
               <w:t xml:space="preserve">Usar </w:t>
             </w:r>
-            <w:r>
-              <w:rPr>
-                <w:rStyle w:val="VerbatimChar"/>
+            <w:proofErr w:type="spellStart"/>
+            <w:r>
+              <w:rPr>
+                <w:rStyle w:val="VerbatimChar"/>
+                <w:lang w:val="es-CO"/>
               </w:rPr>
               <w:t>ProductoFactory</w:t>
             </w:r>
-            <w:r>
+            <w:proofErr w:type="spellEnd"/>
+            <w:r>
+              <w:rPr>
+                <w:lang w:val="es-CO"/>
+              </w:rPr>
               <w:t xml:space="preserve"> dentro de </w:t>
             </w:r>
-            <w:r>
-              <w:rPr>
-                <w:rStyle w:val="VerbatimChar"/>
+            <w:proofErr w:type="spellStart"/>
+            <w:r>
+              <w:rPr>
+                <w:rStyle w:val="VerbatimChar"/>
+                <w:lang w:val="es-CO"/>
               </w:rPr>
               <w:t>ServicioProducto.CargarDesdeArchivo</w:t>
             </w:r>
-            <w:r>
+            <w:proofErr w:type="spellEnd"/>
+            <w:r>
+              <w:rPr>
+                <w:lang w:val="es-CO"/>
+              </w:rPr>
               <w:t xml:space="preserve"> para centralizar la creación</w:t>
             </w:r>
           </w:p>
         </w:tc>
         <w:tc>
           <w:tcPr>
-            <w:tcW w:w="1980" w:type="dxa"/>
-          </w:tcPr>
-          <w:p>
-            <w:pPr>
-              <w:pStyle w:val="Compact"/>
-            </w:pPr>
+            <w:tcW w:w="2264" w:type="dxa"/>
+          </w:tcPr>
+          <w:p>
+            <w:pPr>
+              <w:pStyle w:val="Compact"/>
+            </w:pPr>
+            <w:proofErr w:type="spellStart"/>
             <w:r>
               <w:rPr>
                 <w:b/>
@@ -210,40 +441,128 @@
               </w:rPr>
               <w:t>Rechazado</w:t>
             </w:r>
-          </w:p>
-        </w:tc>
-        <w:tc>
-          <w:tcPr>
-            <w:tcW w:w="1980" w:type="dxa"/>
-          </w:tcPr>
-          <w:p>
-            <w:pPr>
-              <w:pStyle w:val="Compact"/>
-            </w:pPr>
-            <w:r>
-              <w:t xml:space="preserve">La factory fija </w:t>
-            </w:r>
-            <w:r>
-              <w:rPr>
-                <w:rStyle w:val="VerbatimChar"/>
-              </w:rPr>
-              <w:t>StockMinimo = 5</w:t>
-            </w:r>
-            <w:r>
+            <w:proofErr w:type="spellEnd"/>
+          </w:p>
+        </w:tc>
+        <w:tc>
+          <w:tcPr>
+            <w:tcW w:w="2264" w:type="dxa"/>
+          </w:tcPr>
+          <w:p>
+            <w:pPr>
+              <w:pStyle w:val="Compact"/>
+            </w:pPr>
+            <w:r>
+              <w:rPr>
+                <w:lang w:val="es-CO"/>
+              </w:rPr>
+              <w:t xml:space="preserve">La </w:t>
+            </w:r>
+            <w:proofErr w:type="spellStart"/>
+            <w:r>
+              <w:rPr>
+                <w:lang w:val="es-CO"/>
+              </w:rPr>
+              <w:t>factory</w:t>
+            </w:r>
+            <w:proofErr w:type="spellEnd"/>
+            <w:r>
+              <w:rPr>
+                <w:lang w:val="es-CO"/>
+              </w:rPr>
+              <w:t xml:space="preserve"> fija </w:t>
+            </w:r>
+            <w:proofErr w:type="spellStart"/>
+            <w:r>
+              <w:rPr>
+                <w:rStyle w:val="VerbatimChar"/>
+                <w:lang w:val="es-CO"/>
+              </w:rPr>
+              <w:t>StockMinimo</w:t>
+            </w:r>
+            <w:proofErr w:type="spellEnd"/>
+            <w:r>
+              <w:rPr>
+                <w:rStyle w:val="VerbatimChar"/>
+                <w:lang w:val="es-CO"/>
+              </w:rPr>
+              <w:t xml:space="preserve"> = 5</w:t>
+            </w:r>
+            <w:r>
+              <w:rPr>
+                <w:lang w:val="es-CO"/>
+              </w:rPr>
               <w:t xml:space="preserve"> (L23) y </w:t>
             </w:r>
-            <w:r>
-              <w:rPr>
-                <w:rStyle w:val="VerbatimChar"/>
-              </w:rPr>
-              <w:t>FechaVencimiento = Now.AddMonths(6)</w:t>
-            </w:r>
-            <w:r>
-              <w:t xml:space="preserve"> (L24), mientras el método actual los lee del archivo (L103-104). Cambiar la creación alteraría las alertas de stock y vencimiento, es decir, la conducta observable, que la restricción dura prohíbe. Además es código muerto: conectarlo no </w:t>
-            </w:r>
-            <w:r>
+            <w:proofErr w:type="spellStart"/>
+            <w:r>
+              <w:rPr>
+                <w:rStyle w:val="VerbatimChar"/>
+                <w:lang w:val="es-CO"/>
+              </w:rPr>
+              <w:t>FechaVencimiento</w:t>
+            </w:r>
+            <w:proofErr w:type="spellEnd"/>
+            <w:r>
+              <w:rPr>
+                <w:rStyle w:val="VerbatimChar"/>
+                <w:lang w:val="es-CO"/>
+              </w:rPr>
+              <w:t xml:space="preserve"> = </w:t>
+            </w:r>
+            <w:proofErr w:type="spellStart"/>
+            <w:r>
+              <w:rPr>
+                <w:rStyle w:val="VerbatimChar"/>
+                <w:lang w:val="es-CO"/>
+              </w:rPr>
+              <w:t>Now.AddMonths</w:t>
+            </w:r>
+            <w:proofErr w:type="spellEnd"/>
+            <w:r>
+              <w:rPr>
+                <w:rStyle w:val="VerbatimChar"/>
+                <w:lang w:val="es-CO"/>
+              </w:rPr>
+              <w:t>(6)</w:t>
+            </w:r>
+            <w:r>
+              <w:rPr>
+                <w:lang w:val="es-CO"/>
+              </w:rPr>
+              <w:t xml:space="preserve"> (L24), mientras el método actual los lee del archivo (L103-104). Cambiar la creación alteraría las alertas de stock y vencimiento, es decir, la conducta observable, que la restricción dura prohíbe. </w:t>
+            </w:r>
+            <w:proofErr w:type="gramStart"/>
+            <w:r>
+              <w:rPr>
+                <w:lang w:val="es-CO"/>
+              </w:rPr>
+              <w:t>Además</w:t>
+            </w:r>
+            <w:proofErr w:type="gramEnd"/>
+            <w:r>
+              <w:rPr>
+                <w:lang w:val="es-CO"/>
+              </w:rPr>
+              <w:t xml:space="preserve"> es código muerto: conectarlo no resuelve ningún </w:t>
+            </w:r>
+            <w:r>
+              <w:rPr>
+                <w:lang w:val="es-CO"/>
+              </w:rPr>
               <w:lastRenderedPageBreak/>
-              <w:t>resuelve ningún punto de dolor. Queda como R-01 del diagnóstico</w:t>
+              <w:t xml:space="preserve">punto de dolor. </w:t>
+            </w:r>
+            <w:r>
+              <w:t xml:space="preserve">Queda </w:t>
+            </w:r>
+            <w:proofErr w:type="spellStart"/>
+            <w:r>
+              <w:t>como</w:t>
+            </w:r>
+            <w:proofErr w:type="spellEnd"/>
+            <w:r>
+              <w:t xml:space="preserve"> R-01 del diagnóstico</w:t>
             </w:r>
           </w:p>
         </w:tc>
@@ -251,7 +570,7 @@
       <w:tr>
         <w:tc>
           <w:tcPr>
-            <w:tcW w:w="1980" w:type="dxa"/>
+            <w:tcW w:w="2263" w:type="dxa"/>
           </w:tcPr>
           <w:p>
             <w:pPr>
@@ -265,61 +584,90 @@
         </w:tc>
         <w:tc>
           <w:tcPr>
-            <w:tcW w:w="1980" w:type="dxa"/>
-          </w:tcPr>
-          <w:p>
-            <w:pPr>
-              <w:pStyle w:val="Compact"/>
-            </w:pPr>
-            <w:r>
+            <w:tcW w:w="2263" w:type="dxa"/>
+          </w:tcPr>
+          <w:p>
+            <w:pPr>
+              <w:pStyle w:val="Compact"/>
+              <w:rPr>
+                <w:lang w:val="es-CO"/>
+              </w:rPr>
+            </w:pPr>
+            <w:r>
+              <w:rPr>
+                <w:lang w:val="es-CO"/>
+              </w:rPr>
               <w:t xml:space="preserve">Ampliar </w:t>
             </w:r>
-            <w:r>
-              <w:rPr>
-                <w:rStyle w:val="VerbatimChar"/>
+            <w:proofErr w:type="spellStart"/>
+            <w:r>
+              <w:rPr>
+                <w:rStyle w:val="VerbatimChar"/>
+                <w:lang w:val="es-CO"/>
               </w:rPr>
               <w:t>DatosProducto</w:t>
             </w:r>
-            <w:r>
+            <w:proofErr w:type="spellEnd"/>
+            <w:r>
+              <w:rPr>
+                <w:lang w:val="es-CO"/>
+              </w:rPr>
               <w:t xml:space="preserve"> con </w:t>
             </w:r>
             <w:r>
               <w:rPr>
                 <w:rStyle w:val="VerbatimChar"/>
+                <w:lang w:val="es-CO"/>
               </w:rPr>
               <w:t>Marca</w:t>
             </w:r>
             <w:r>
+              <w:rPr>
+                <w:lang w:val="es-CO"/>
+              </w:rPr>
               <w:t xml:space="preserve">, </w:t>
             </w:r>
-            <w:r>
-              <w:rPr>
-                <w:rStyle w:val="VerbatimChar"/>
+            <w:proofErr w:type="spellStart"/>
+            <w:r>
+              <w:rPr>
+                <w:rStyle w:val="VerbatimChar"/>
+                <w:lang w:val="es-CO"/>
               </w:rPr>
               <w:t>Presentacion</w:t>
             </w:r>
-            <w:r>
+            <w:proofErr w:type="spellEnd"/>
+            <w:r>
+              <w:rPr>
+                <w:lang w:val="es-CO"/>
+              </w:rPr>
               <w:t xml:space="preserve"> y </w:t>
             </w:r>
-            <w:r>
-              <w:rPr>
-                <w:rStyle w:val="VerbatimChar"/>
+            <w:proofErr w:type="spellStart"/>
+            <w:r>
+              <w:rPr>
+                <w:rStyle w:val="VerbatimChar"/>
+                <w:lang w:val="es-CO"/>
               </w:rPr>
               <w:t>Categoria</w:t>
             </w:r>
-            <w:r>
+            <w:proofErr w:type="spellEnd"/>
+            <w:r>
+              <w:rPr>
+                <w:lang w:val="es-CO"/>
+              </w:rPr>
               <w:t xml:space="preserve"> para que los creadores de SC-1 pudieran construir sus objetos</w:t>
             </w:r>
           </w:p>
         </w:tc>
         <w:tc>
           <w:tcPr>
-            <w:tcW w:w="1980" w:type="dxa"/>
-          </w:tcPr>
-          <w:p>
-            <w:pPr>
-              <w:pStyle w:val="Compact"/>
-            </w:pPr>
+            <w:tcW w:w="2264" w:type="dxa"/>
+          </w:tcPr>
+          <w:p>
+            <w:pPr>
+              <w:pStyle w:val="Compact"/>
+            </w:pPr>
+            <w:proofErr w:type="spellStart"/>
             <w:r>
               <w:rPr>
                 <w:b/>
@@ -327,26 +675,69 @@
               </w:rPr>
               <w:t>Rechazado</w:t>
             </w:r>
-          </w:p>
-        </w:tc>
-        <w:tc>
-          <w:tcPr>
-            <w:tcW w:w="1980" w:type="dxa"/>
-          </w:tcPr>
-          <w:p>
-            <w:pPr>
-              <w:pStyle w:val="Compact"/>
-            </w:pPr>
-            <w:r>
+            <w:proofErr w:type="spellEnd"/>
+          </w:p>
+        </w:tc>
+        <w:tc>
+          <w:tcPr>
+            <w:tcW w:w="2264" w:type="dxa"/>
+          </w:tcPr>
+          <w:p>
+            <w:pPr>
+              <w:pStyle w:val="Compact"/>
+              <w:rPr>
+                <w:lang w:val="es-CO"/>
+              </w:rPr>
+            </w:pPr>
+            <w:r>
+              <w:rPr>
+                <w:lang w:val="es-CO"/>
+              </w:rPr>
               <w:t xml:space="preserve">Convertiría el DTO en la unión de los campos de todos los tipos: cada producto nuevo obligaría a modificarlo. Es el defecto H-06 movido del cargador al DTO. La métrica del criterio 5 habría quedado en 1 clase modificada en vez de 0, incumpliendo los criterios de aceptación 1 y 5 del propio ADR-006. Se adoptó </w:t>
             </w:r>
             <w:r>
               <w:rPr>
                 <w:rStyle w:val="VerbatimChar"/>
-              </w:rPr>
-              <w:t>Extra: IReadOnlyList&lt;string&gt;</w:t>
-            </w:r>
-            <w:r>
+                <w:lang w:val="es-CO"/>
+              </w:rPr>
+              <w:t xml:space="preserve">Extra: </w:t>
+            </w:r>
+            <w:proofErr w:type="spellStart"/>
+            <w:r>
+              <w:rPr>
+                <w:rStyle w:val="VerbatimChar"/>
+                <w:lang w:val="es-CO"/>
+              </w:rPr>
+              <w:t>IReadOnlyList</w:t>
+            </w:r>
+            <w:proofErr w:type="spellEnd"/>
+            <w:r>
+              <w:rPr>
+                <w:rStyle w:val="VerbatimChar"/>
+                <w:lang w:val="es-CO"/>
+              </w:rPr>
+              <w:t>&lt;</w:t>
+            </w:r>
+            <w:proofErr w:type="spellStart"/>
+            <w:r>
+              <w:rPr>
+                <w:rStyle w:val="VerbatimChar"/>
+                <w:lang w:val="es-CO"/>
+              </w:rPr>
+              <w:t>string</w:t>
+            </w:r>
+            <w:proofErr w:type="spellEnd"/>
+            <w:r>
+              <w:rPr>
+                <w:rStyle w:val="VerbatimChar"/>
+                <w:lang w:val="es-CO"/>
+              </w:rPr>
+              <w:t>&gt;</w:t>
+            </w:r>
+            <w:r>
+              <w:rPr>
+                <w:lang w:val="es-CO"/>
+              </w:rPr>
               <w:t>, donde cada creador interpreta solo sus columnas</w:t>
             </w:r>
           </w:p>
@@ -355,7 +746,7 @@
       <w:tr>
         <w:tc>
           <w:tcPr>
-            <w:tcW w:w="1980" w:type="dxa"/>
+            <w:tcW w:w="2263" w:type="dxa"/>
           </w:tcPr>
           <w:p>
             <w:pPr>
@@ -368,25 +759,32 @@
         </w:tc>
         <w:tc>
           <w:tcPr>
-            <w:tcW w:w="1980" w:type="dxa"/>
-          </w:tcPr>
-          <w:p>
-            <w:pPr>
-              <w:pStyle w:val="Compact"/>
-            </w:pPr>
-            <w:r>
+            <w:tcW w:w="2263" w:type="dxa"/>
+          </w:tcPr>
+          <w:p>
+            <w:pPr>
+              <w:pStyle w:val="Compact"/>
+              <w:rPr>
+                <w:lang w:val="es-CO"/>
+              </w:rPr>
+            </w:pPr>
+            <w:r>
+              <w:rPr>
+                <w:lang w:val="es-CO"/>
+              </w:rPr>
               <w:t>Agregar validación de stock disponible antes de descontar, para corregir el inventario negativo</w:t>
             </w:r>
           </w:p>
         </w:tc>
         <w:tc>
           <w:tcPr>
-            <w:tcW w:w="1980" w:type="dxa"/>
-          </w:tcPr>
-          <w:p>
-            <w:pPr>
-              <w:pStyle w:val="Compact"/>
-            </w:pPr>
+            <w:tcW w:w="2264" w:type="dxa"/>
+          </w:tcPr>
+          <w:p>
+            <w:pPr>
+              <w:pStyle w:val="Compact"/>
+            </w:pPr>
+            <w:proofErr w:type="spellStart"/>
             <w:r>
               <w:rPr>
                 <w:b/>
@@ -394,22 +792,32 @@
               </w:rPr>
               <w:t>Rechazado</w:t>
             </w:r>
-          </w:p>
-        </w:tc>
-        <w:tc>
-          <w:tcPr>
-            <w:tcW w:w="1980" w:type="dxa"/>
-          </w:tcPr>
-          <w:p>
-            <w:pPr>
-              <w:pStyle w:val="Compact"/>
-            </w:pPr>
-            <w:r>
-              <w:t xml:space="preserve">Es el hallazgo H-07 y es un defecto real, pero corregirlo cambia una regla de negocio. La restricción dura lo prohíbe explícitamente y la penalización es de 0.5 por caso. Se documenta como deuda técnica consciente y se usa </w:t>
-            </w:r>
-            <w:r>
+            <w:proofErr w:type="spellEnd"/>
+          </w:p>
+        </w:tc>
+        <w:tc>
+          <w:tcPr>
+            <w:tcW w:w="2264" w:type="dxa"/>
+          </w:tcPr>
+          <w:p>
+            <w:pPr>
+              <w:pStyle w:val="Compact"/>
+              <w:rPr>
+                <w:lang w:val="es-CO"/>
+              </w:rPr>
+            </w:pPr>
+            <w:r>
+              <w:rPr>
+                <w:lang w:val="es-CO"/>
+              </w:rPr>
+              <w:t xml:space="preserve">Es el hallazgo H-07 y es un defecto real, pero corregirlo cambia una regla de negocio. La restricción dura lo prohíbe explícitamente y la penalización es de 0.5 por caso. Se documenta como deuda técnica consciente y se usa como caso de </w:t>
+            </w:r>
+            <w:r>
+              <w:rPr>
+                <w:lang w:val="es-CO"/>
+              </w:rPr>
               <w:lastRenderedPageBreak/>
-              <w:t>como caso de caracterización CC-09</w:t>
+              <w:t>caracterización CC-09</w:t>
             </w:r>
           </w:p>
         </w:tc>
@@ -417,7 +825,7 @@
       <w:tr>
         <w:tc>
           <w:tcPr>
-            <w:tcW w:w="1980" w:type="dxa"/>
+            <w:tcW w:w="2263" w:type="dxa"/>
           </w:tcPr>
           <w:p>
             <w:pPr>
@@ -431,25 +839,32 @@
         </w:tc>
         <w:tc>
           <w:tcPr>
-            <w:tcW w:w="1980" w:type="dxa"/>
-          </w:tcPr>
-          <w:p>
-            <w:pPr>
-              <w:pStyle w:val="Compact"/>
-            </w:pPr>
-            <w:r>
+            <w:tcW w:w="2263" w:type="dxa"/>
+          </w:tcPr>
+          <w:p>
+            <w:pPr>
+              <w:pStyle w:val="Compact"/>
+              <w:rPr>
+                <w:lang w:val="es-CO"/>
+              </w:rPr>
+            </w:pPr>
+            <w:r>
+              <w:rPr>
+                <w:lang w:val="es-CO"/>
+              </w:rPr>
               <w:t>Agregar al menú una opción para dar de alta productos</w:t>
             </w:r>
           </w:p>
         </w:tc>
         <w:tc>
           <w:tcPr>
-            <w:tcW w:w="1980" w:type="dxa"/>
-          </w:tcPr>
-          <w:p>
-            <w:pPr>
-              <w:pStyle w:val="Compact"/>
-            </w:pPr>
+            <w:tcW w:w="2264" w:type="dxa"/>
+          </w:tcPr>
+          <w:p>
+            <w:pPr>
+              <w:pStyle w:val="Compact"/>
+            </w:pPr>
+            <w:proofErr w:type="spellStart"/>
             <w:r>
               <w:rPr>
                 <w:b/>
@@ -457,17 +872,24 @@
               </w:rPr>
               <w:t>Rechazado</w:t>
             </w:r>
-          </w:p>
-        </w:tc>
-        <w:tc>
-          <w:tcPr>
-            <w:tcW w:w="1980" w:type="dxa"/>
-          </w:tcPr>
-          <w:p>
-            <w:pPr>
-              <w:pStyle w:val="Compact"/>
-            </w:pPr>
-            <w:r>
+            <w:proofErr w:type="spellEnd"/>
+          </w:p>
+        </w:tc>
+        <w:tc>
+          <w:tcPr>
+            <w:tcW w:w="2264" w:type="dxa"/>
+          </w:tcPr>
+          <w:p>
+            <w:pPr>
+              <w:pStyle w:val="Compact"/>
+              <w:rPr>
+                <w:lang w:val="es-CO"/>
+              </w:rPr>
+            </w:pPr>
+            <w:r>
+              <w:rPr>
+                <w:lang w:val="es-CO"/>
+              </w:rPr>
               <w:t>Ninguna solicitud de cambio la pide. Sería funcionalidad nueva, no rediseño, y alteraría la conducta observable. El sistema original solo carga productos desde el archivo al arrancar</w:t>
             </w:r>
           </w:p>
@@ -476,7 +898,7 @@
       <w:tr>
         <w:tc>
           <w:tcPr>
-            <w:tcW w:w="1980" w:type="dxa"/>
+            <w:tcW w:w="2263" w:type="dxa"/>
           </w:tcPr>
           <w:p>
             <w:pPr>
@@ -489,61 +911,92 @@
         </w:tc>
         <w:tc>
           <w:tcPr>
-            <w:tcW w:w="1980" w:type="dxa"/>
-          </w:tcPr>
-          <w:p>
-            <w:pPr>
-              <w:pStyle w:val="Compact"/>
-            </w:pPr>
-            <w:r>
+            <w:tcW w:w="2263" w:type="dxa"/>
+          </w:tcPr>
+          <w:p>
+            <w:pPr>
+              <w:pStyle w:val="Compact"/>
+              <w:rPr>
+                <w:lang w:val="es-CO"/>
+              </w:rPr>
+            </w:pPr>
+            <w:r>
+              <w:rPr>
+                <w:lang w:val="es-CO"/>
+              </w:rPr>
               <w:t>Eliminar el código muerto (</w:t>
             </w:r>
-            <w:r>
-              <w:rPr>
-                <w:rStyle w:val="VerbatimChar"/>
+            <w:proofErr w:type="spellStart"/>
+            <w:r>
+              <w:rPr>
+                <w:rStyle w:val="VerbatimChar"/>
+                <w:lang w:val="es-CO"/>
               </w:rPr>
               <w:t>ProductoFactory</w:t>
             </w:r>
-            <w:r>
+            <w:proofErr w:type="spellEnd"/>
+            <w:r>
+              <w:rPr>
+                <w:lang w:val="es-CO"/>
+              </w:rPr>
               <w:t xml:space="preserve">, </w:t>
             </w:r>
-            <w:r>
-              <w:rPr>
-                <w:rStyle w:val="VerbatimChar"/>
+            <w:proofErr w:type="spellStart"/>
+            <w:r>
+              <w:rPr>
+                <w:rStyle w:val="VerbatimChar"/>
+                <w:lang w:val="es-CO"/>
               </w:rPr>
               <w:t>AspectoValidacion</w:t>
             </w:r>
-            <w:r>
+            <w:proofErr w:type="spellEnd"/>
+            <w:r>
+              <w:rPr>
+                <w:lang w:val="es-CO"/>
+              </w:rPr>
               <w:t xml:space="preserve">, </w:t>
             </w:r>
-            <w:r>
-              <w:rPr>
-                <w:rStyle w:val="VerbatimChar"/>
+            <w:proofErr w:type="spellStart"/>
+            <w:r>
+              <w:rPr>
+                <w:rStyle w:val="VerbatimChar"/>
+                <w:lang w:val="es-CO"/>
               </w:rPr>
               <w:t>ServicioDescuento</w:t>
             </w:r>
-            <w:r>
+            <w:proofErr w:type="spellEnd"/>
+            <w:r>
+              <w:rPr>
+                <w:lang w:val="es-CO"/>
+              </w:rPr>
               <w:t xml:space="preserve">, </w:t>
             </w:r>
-            <w:r>
-              <w:rPr>
-                <w:rStyle w:val="VerbatimChar"/>
+            <w:proofErr w:type="spellStart"/>
+            <w:r>
+              <w:rPr>
+                <w:rStyle w:val="VerbatimChar"/>
+                <w:lang w:val="es-CO"/>
               </w:rPr>
               <w:t>ServicioNotificacion</w:t>
             </w:r>
-            <w:r>
+            <w:proofErr w:type="spellEnd"/>
+            <w:r>
+              <w:rPr>
+                <w:lang w:val="es-CO"/>
+              </w:rPr>
               <w:t xml:space="preserve"> y sus dos interfaces)</w:t>
             </w:r>
           </w:p>
         </w:tc>
         <w:tc>
           <w:tcPr>
-            <w:tcW w:w="1980" w:type="dxa"/>
-          </w:tcPr>
-          <w:p>
-            <w:pPr>
-              <w:pStyle w:val="Compact"/>
-            </w:pPr>
+            <w:tcW w:w="2264" w:type="dxa"/>
+          </w:tcPr>
+          <w:p>
+            <w:pPr>
+              <w:pStyle w:val="Compact"/>
+            </w:pPr>
+            <w:proofErr w:type="spellStart"/>
             <w:r>
               <w:rPr>
                 <w:b/>
@@ -551,26 +1004,41 @@
               </w:rPr>
               <w:t>Rechazado</w:t>
             </w:r>
-          </w:p>
-        </w:tc>
-        <w:tc>
-          <w:tcPr>
-            <w:tcW w:w="1980" w:type="dxa"/>
-          </w:tcPr>
-          <w:p>
-            <w:pPr>
-              <w:pStyle w:val="Compact"/>
-            </w:pPr>
-            <w:r>
-              <w:t>Borrarlo es un cambio que ningún punto de dolor exige y que ningún ADR respalda. Se documenta como H-08 y se conserva en negro en el TO-BE, declarado deuda técnica consciente. Es el límite deliberado al rediseño para evitar sobre-ingeniería</w:t>
-            </w:r>
+            <w:proofErr w:type="spellEnd"/>
+          </w:p>
+        </w:tc>
+        <w:tc>
+          <w:tcPr>
+            <w:tcW w:w="2264" w:type="dxa"/>
+          </w:tcPr>
+          <w:p>
+            <w:pPr>
+              <w:pStyle w:val="Compact"/>
+              <w:rPr>
+                <w:lang w:val="es-CO"/>
+              </w:rPr>
+            </w:pPr>
+            <w:r>
+              <w:rPr>
+                <w:lang w:val="es-CO"/>
+              </w:rPr>
+              <w:t xml:space="preserve">Borrarlo es un cambio que ningún punto de dolor exige y que ningún ADR respalda. Se documenta como H-08 y se conserva en negro en el TO-BE, declarado deuda técnica consciente. Es el límite deliberado al rediseño para evitar </w:t>
+            </w:r>
+            <w:proofErr w:type="spellStart"/>
+            <w:r>
+              <w:rPr>
+                <w:lang w:val="es-CO"/>
+              </w:rPr>
+              <w:t>sobre-ingeniería</w:t>
+            </w:r>
+            <w:proofErr w:type="spellEnd"/>
           </w:p>
         </w:tc>
       </w:tr>
       <w:tr>
         <w:tc>
           <w:tcPr>
-            <w:tcW w:w="1980" w:type="dxa"/>
+            <w:tcW w:w="2263" w:type="dxa"/>
           </w:tcPr>
           <w:p>
             <w:pPr>
@@ -583,49 +1051,69 @@
         </w:tc>
         <w:tc>
           <w:tcPr>
-            <w:tcW w:w="1980" w:type="dxa"/>
-          </w:tcPr>
-          <w:p>
-            <w:pPr>
-              <w:pStyle w:val="Compact"/>
-            </w:pPr>
-            <w:r>
+            <w:tcW w:w="2263" w:type="dxa"/>
+          </w:tcPr>
+          <w:p>
+            <w:pPr>
+              <w:pStyle w:val="Compact"/>
+              <w:rPr>
+                <w:lang w:val="es-CO"/>
+              </w:rPr>
+            </w:pPr>
+            <w:r>
+              <w:rPr>
+                <w:lang w:val="es-CO"/>
+              </w:rPr>
               <w:t xml:space="preserve">Resolver la carga de varios tipos con un </w:t>
             </w:r>
-            <w:r>
-              <w:rPr>
-                <w:rStyle w:val="VerbatimChar"/>
+            <w:proofErr w:type="spellStart"/>
+            <w:r>
+              <w:rPr>
+                <w:rStyle w:val="VerbatimChar"/>
+                <w:lang w:val="es-CO"/>
               </w:rPr>
               <w:t>if</w:t>
             </w:r>
-            <w:r>
+            <w:proofErr w:type="spellEnd"/>
+            <w:r>
+              <w:rPr>
+                <w:lang w:val="es-CO"/>
+              </w:rPr>
               <w:t>/</w:t>
             </w:r>
             <w:r>
               <w:rPr>
                 <w:rStyle w:val="VerbatimChar"/>
+                <w:lang w:val="es-CO"/>
               </w:rPr>
               <w:t>switch</w:t>
             </w:r>
             <w:r>
+              <w:rPr>
+                <w:lang w:val="es-CO"/>
+              </w:rPr>
               <w:t xml:space="preserve"> por tipo dentro de </w:t>
             </w:r>
-            <w:r>
-              <w:rPr>
-                <w:rStyle w:val="VerbatimChar"/>
+            <w:proofErr w:type="spellStart"/>
+            <w:r>
+              <w:rPr>
+                <w:rStyle w:val="VerbatimChar"/>
+                <w:lang w:val="es-CO"/>
               </w:rPr>
               <w:t>CargadorProductosTxt</w:t>
             </w:r>
-          </w:p>
-        </w:tc>
-        <w:tc>
-          <w:tcPr>
-            <w:tcW w:w="1980" w:type="dxa"/>
-          </w:tcPr>
-          <w:p>
-            <w:pPr>
-              <w:pStyle w:val="Compact"/>
-            </w:pPr>
+            <w:proofErr w:type="spellEnd"/>
+          </w:p>
+        </w:tc>
+        <w:tc>
+          <w:tcPr>
+            <w:tcW w:w="2264" w:type="dxa"/>
+          </w:tcPr>
+          <w:p>
+            <w:pPr>
+              <w:pStyle w:val="Compact"/>
+            </w:pPr>
+            <w:proofErr w:type="spellStart"/>
             <w:r>
               <w:rPr>
                 <w:b/>
@@ -633,18 +1121,46 @@
               </w:rPr>
               <w:t>Rechazado</w:t>
             </w:r>
-          </w:p>
-        </w:tc>
-        <w:tc>
-          <w:tcPr>
-            <w:tcW w:w="1980" w:type="dxa"/>
-          </w:tcPr>
-          <w:p>
-            <w:pPr>
-              <w:pStyle w:val="Compact"/>
-            </w:pPr>
-            <w:r>
-              <w:t>Cada producto futuro volvería a modificar el cargador: es H-06 movido de sitio. Registrado como alternativa 1 descartada en ADR-006</w:t>
+            <w:proofErr w:type="spellEnd"/>
+          </w:p>
+        </w:tc>
+        <w:tc>
+          <w:tcPr>
+            <w:tcW w:w="2264" w:type="dxa"/>
+          </w:tcPr>
+          <w:p>
+            <w:pPr>
+              <w:pStyle w:val="Compact"/>
+            </w:pPr>
+            <w:r>
+              <w:rPr>
+                <w:lang w:val="es-CO"/>
+              </w:rPr>
+              <w:t xml:space="preserve">Cada producto futuro volvería a modificar el cargador: es H-06 movido de sitio. </w:t>
+            </w:r>
+            <w:proofErr w:type="spellStart"/>
+            <w:r>
+              <w:t>Registrado</w:t>
+            </w:r>
+            <w:proofErr w:type="spellEnd"/>
+            <w:r>
+              <w:t xml:space="preserve"> </w:t>
+            </w:r>
+            <w:proofErr w:type="spellStart"/>
+            <w:r>
+              <w:t>como</w:t>
+            </w:r>
+            <w:proofErr w:type="spellEnd"/>
+            <w:r>
+              <w:t xml:space="preserve"> </w:t>
+            </w:r>
+            <w:proofErr w:type="spellStart"/>
+            <w:r>
+              <w:t>alternativa</w:t>
+            </w:r>
+            <w:proofErr w:type="spellEnd"/>
+            <w:r>
+              <w:t xml:space="preserve"> 1 descartada en ADR-006</w:t>
             </w:r>
           </w:p>
         </w:tc>
@@ -652,7 +1168,7 @@
       <w:tr>
         <w:tc>
           <w:tcPr>
-            <w:tcW w:w="1980" w:type="dxa"/>
+            <w:tcW w:w="2263" w:type="dxa"/>
           </w:tcPr>
           <w:p>
             <w:pPr>
@@ -665,53 +1181,86 @@
         </w:tc>
         <w:tc>
           <w:tcPr>
-            <w:tcW w:w="1980" w:type="dxa"/>
-          </w:tcPr>
-          <w:p>
-            <w:pPr>
-              <w:pStyle w:val="Compact"/>
-            </w:pPr>
-            <w:r>
-              <w:t xml:space="preserve">Un cargador TXT por cada tipo de </w:t>
-            </w:r>
-            <w:r>
-              <w:lastRenderedPageBreak/>
-              <w:t>producto</w:t>
-            </w:r>
-          </w:p>
-        </w:tc>
-        <w:tc>
-          <w:tcPr>
-            <w:tcW w:w="1980" w:type="dxa"/>
-          </w:tcPr>
-          <w:p>
-            <w:pPr>
-              <w:pStyle w:val="Compact"/>
-            </w:pPr>
+            <w:tcW w:w="2263" w:type="dxa"/>
+          </w:tcPr>
+          <w:p>
+            <w:pPr>
+              <w:pStyle w:val="Compact"/>
+              <w:rPr>
+                <w:lang w:val="es-CO"/>
+              </w:rPr>
+            </w:pPr>
+            <w:r>
+              <w:rPr>
+                <w:lang w:val="es-CO"/>
+              </w:rPr>
+              <w:t>Un cargador TXT por cada tipo de producto</w:t>
+            </w:r>
+          </w:p>
+        </w:tc>
+        <w:tc>
+          <w:tcPr>
+            <w:tcW w:w="2264" w:type="dxa"/>
+          </w:tcPr>
+          <w:p>
+            <w:pPr>
+              <w:pStyle w:val="Compact"/>
+            </w:pPr>
+            <w:proofErr w:type="spellStart"/>
             <w:r>
               <w:rPr>
                 <w:b/>
                 <w:bCs/>
               </w:rPr>
+              <w:t>Rechazado</w:t>
+            </w:r>
+            <w:proofErr w:type="spellEnd"/>
+          </w:p>
+        </w:tc>
+        <w:tc>
+          <w:tcPr>
+            <w:tcW w:w="2264" w:type="dxa"/>
+          </w:tcPr>
+          <w:p>
+            <w:pPr>
+              <w:pStyle w:val="Compact"/>
+            </w:pPr>
+            <w:r>
+              <w:rPr>
+                <w:lang w:val="es-CO"/>
+              </w:rPr>
+              <w:t xml:space="preserve">Duplicaría en cada cargador la lectura, el delimitador y las </w:t>
+            </w:r>
+            <w:r>
+              <w:rPr>
+                <w:lang w:val="es-CO"/>
+              </w:rPr>
               <w:lastRenderedPageBreak/>
-              <w:t>Rechazado</w:t>
-            </w:r>
-          </w:p>
-        </w:tc>
-        <w:tc>
-          <w:tcPr>
-            <w:tcW w:w="1980" w:type="dxa"/>
-          </w:tcPr>
-          <w:p>
-            <w:pPr>
-              <w:pStyle w:val="Compact"/>
-            </w:pPr>
-            <w:r>
-              <w:t xml:space="preserve">Duplicaría en cada cargador la lectura, </w:t>
-            </w:r>
-            <w:r>
-              <w:lastRenderedPageBreak/>
-              <w:t>el delimitador y las conversiones, que es justo la responsabilidad que ADR-002 acababa de concentrar en un solo sitio. Registrado como alternativa 2 descartada en ADR-006</w:t>
+              <w:t xml:space="preserve">conversiones, que es justo la responsabilidad que ADR-002 acababa de concentrar en un solo sitio. </w:t>
+            </w:r>
+            <w:proofErr w:type="spellStart"/>
+            <w:r>
+              <w:t>Registrado</w:t>
+            </w:r>
+            <w:proofErr w:type="spellEnd"/>
+            <w:r>
+              <w:t xml:space="preserve"> </w:t>
+            </w:r>
+            <w:proofErr w:type="spellStart"/>
+            <w:r>
+              <w:t>como</w:t>
+            </w:r>
+            <w:proofErr w:type="spellEnd"/>
+            <w:r>
+              <w:t xml:space="preserve"> </w:t>
+            </w:r>
+            <w:proofErr w:type="spellStart"/>
+            <w:r>
+              <w:t>alternativa</w:t>
+            </w:r>
+            <w:proofErr w:type="spellEnd"/>
+            <w:r>
+              <w:t xml:space="preserve"> 2 descartada en ADR-006</w:t>
             </w:r>
           </w:p>
         </w:tc>
@@ -719,7 +1268,7 @@
       <w:tr>
         <w:tc>
           <w:tcPr>
-            <w:tcW w:w="1980" w:type="dxa"/>
+            <w:tcW w:w="2263" w:type="dxa"/>
           </w:tcPr>
           <w:p>
             <w:pPr>
@@ -733,34 +1282,45 @@
         </w:tc>
         <w:tc>
           <w:tcPr>
-            <w:tcW w:w="1980" w:type="dxa"/>
-          </w:tcPr>
-          <w:p>
-            <w:pPr>
-              <w:pStyle w:val="Compact"/>
-            </w:pPr>
-            <w:r>
+            <w:tcW w:w="2263" w:type="dxa"/>
+          </w:tcPr>
+          <w:p>
+            <w:pPr>
+              <w:pStyle w:val="Compact"/>
+              <w:rPr>
+                <w:lang w:val="es-CO"/>
+              </w:rPr>
+            </w:pPr>
+            <w:r>
+              <w:rPr>
+                <w:lang w:val="es-CO"/>
+              </w:rPr>
               <w:t xml:space="preserve">Colorear la jerarquía </w:t>
             </w:r>
             <w:r>
               <w:rPr>
                 <w:rStyle w:val="VerbatimChar"/>
+                <w:lang w:val="es-CO"/>
               </w:rPr>
               <w:t>Producto</w:t>
             </w:r>
             <w:r>
+              <w:rPr>
+                <w:lang w:val="es-CO"/>
+              </w:rPr>
               <w:t xml:space="preserve"> con el color de LSP en el diagrama TO-BE</w:t>
             </w:r>
           </w:p>
         </w:tc>
         <w:tc>
           <w:tcPr>
-            <w:tcW w:w="1980" w:type="dxa"/>
-          </w:tcPr>
-          <w:p>
-            <w:pPr>
-              <w:pStyle w:val="Compact"/>
-            </w:pPr>
+            <w:tcW w:w="2264" w:type="dxa"/>
+          </w:tcPr>
+          <w:p>
+            <w:pPr>
+              <w:pStyle w:val="Compact"/>
+            </w:pPr>
+            <w:proofErr w:type="spellStart"/>
             <w:r>
               <w:rPr>
                 <w:b/>
@@ -768,17 +1328,24 @@
               </w:rPr>
               <w:t>Corregido</w:t>
             </w:r>
-          </w:p>
-        </w:tc>
-        <w:tc>
-          <w:tcPr>
-            <w:tcW w:w="1980" w:type="dxa"/>
-          </w:tcPr>
-          <w:p>
-            <w:pPr>
-              <w:pStyle w:val="Compact"/>
-            </w:pPr>
-            <w:r>
+            <w:proofErr w:type="spellEnd"/>
+          </w:p>
+        </w:tc>
+        <w:tc>
+          <w:tcPr>
+            <w:tcW w:w="2264" w:type="dxa"/>
+          </w:tcPr>
+          <w:p>
+            <w:pPr>
+              <w:pStyle w:val="Compact"/>
+              <w:rPr>
+                <w:lang w:val="es-CO"/>
+              </w:rPr>
+            </w:pPr>
+            <w:r>
+              <w:rPr>
+                <w:lang w:val="es-CO"/>
+              </w:rPr>
               <w:t>LSP aquí no es una intervención sino una verificación que la jerarquía pasa, y por eso se conserva. Colorearla la haría leer como intervenida, contra la convención de que lo conservado va en negro. Se dejó en negro y LSP se acredita con una nota enlazada</w:t>
             </w:r>
           </w:p>
@@ -787,7 +1354,7 @@
       <w:tr>
         <w:tc>
           <w:tcPr>
-            <w:tcW w:w="1980" w:type="dxa"/>
+            <w:tcW w:w="2263" w:type="dxa"/>
           </w:tcPr>
           <w:p>
             <w:pPr>
@@ -800,43 +1367,60 @@
         </w:tc>
         <w:tc>
           <w:tcPr>
-            <w:tcW w:w="1980" w:type="dxa"/>
-          </w:tcPr>
-          <w:p>
-            <w:pPr>
-              <w:pStyle w:val="Compact"/>
-            </w:pPr>
-            <w:r>
+            <w:tcW w:w="2263" w:type="dxa"/>
+          </w:tcPr>
+          <w:p>
+            <w:pPr>
+              <w:pStyle w:val="Compact"/>
+              <w:rPr>
+                <w:lang w:val="es-CO"/>
+              </w:rPr>
+            </w:pPr>
+            <w:r>
+              <w:rPr>
+                <w:lang w:val="es-CO"/>
+              </w:rPr>
               <w:t xml:space="preserve">Mostrar en </w:t>
             </w:r>
-            <w:r>
-              <w:rPr>
-                <w:rStyle w:val="VerbatimChar"/>
+            <w:proofErr w:type="spellStart"/>
+            <w:r>
+              <w:rPr>
+                <w:rStyle w:val="VerbatimChar"/>
+                <w:lang w:val="es-CO"/>
               </w:rPr>
               <w:t>Cosmetico</w:t>
             </w:r>
-            <w:r>
+            <w:proofErr w:type="spellEnd"/>
+            <w:r>
+              <w:rPr>
+                <w:lang w:val="es-CO"/>
+              </w:rPr>
               <w:t xml:space="preserve"> y </w:t>
             </w:r>
             <w:r>
               <w:rPr>
                 <w:rStyle w:val="VerbatimChar"/>
+                <w:lang w:val="es-CO"/>
               </w:rPr>
               <w:t>Comestible</w:t>
             </w:r>
             <w:r>
+              <w:rPr>
+                <w:lang w:val="es-CO"/>
+              </w:rPr>
               <w:t xml:space="preserve"> solo sus atributos propios</w:t>
             </w:r>
           </w:p>
         </w:tc>
         <w:tc>
           <w:tcPr>
-            <w:tcW w:w="1980" w:type="dxa"/>
-          </w:tcPr>
-          <w:p>
-            <w:pPr>
-              <w:pStyle w:val="Compact"/>
-            </w:pPr>
+            <w:tcW w:w="2264" w:type="dxa"/>
+          </w:tcPr>
+          <w:p>
+            <w:pPr>
+              <w:pStyle w:val="Compact"/>
+            </w:pPr>
+            <w:proofErr w:type="spellStart"/>
             <w:r>
               <w:rPr>
                 <w:b/>
@@ -844,36 +1428,77 @@
               </w:rPr>
               <w:t>Corregido</w:t>
             </w:r>
-          </w:p>
-        </w:tc>
-        <w:tc>
-          <w:tcPr>
-            <w:tcW w:w="1980" w:type="dxa"/>
-          </w:tcPr>
-          <w:p>
-            <w:pPr>
-              <w:pStyle w:val="Compact"/>
-            </w:pPr>
-            <w:r>
+            <w:proofErr w:type="spellEnd"/>
+          </w:p>
+        </w:tc>
+        <w:tc>
+          <w:tcPr>
+            <w:tcW w:w="2264" w:type="dxa"/>
+          </w:tcPr>
+          <w:p>
+            <w:pPr>
+              <w:pStyle w:val="Compact"/>
+            </w:pPr>
+            <w:r>
+              <w:rPr>
+                <w:lang w:val="es-CO"/>
+              </w:rPr>
               <w:t xml:space="preserve">Sin </w:t>
             </w:r>
             <w:r>
               <w:rPr>
                 <w:rStyle w:val="VerbatimChar"/>
+                <w:lang w:val="es-CO"/>
               </w:rPr>
               <w:t>Stock</w:t>
             </w:r>
             <w:r>
+              <w:rPr>
+                <w:lang w:val="es-CO"/>
+              </w:rPr>
               <w:t xml:space="preserve"> y </w:t>
             </w:r>
-            <w:r>
-              <w:rPr>
-                <w:rStyle w:val="VerbatimChar"/>
+            <w:proofErr w:type="spellStart"/>
+            <w:r>
+              <w:rPr>
+                <w:rStyle w:val="VerbatimChar"/>
+                <w:lang w:val="es-CO"/>
               </w:rPr>
               <w:t>FechaVencimiento</w:t>
             </w:r>
-            <w:r>
-              <w:t xml:space="preserve"> visibles, el diagrama sugiere que el monitoreo no aplica a los tipos nuevos, lo contrario de lo que afirma la verificación LSP. Se añadieron los miembros heredados bajo un separador explícito</w:t>
+            <w:proofErr w:type="spellEnd"/>
+            <w:r>
+              <w:rPr>
+                <w:lang w:val="es-CO"/>
+              </w:rPr>
+              <w:t xml:space="preserve"> visibles, el diagrama sugiere que el monitoreo no aplica a los tipos nuevos, lo contrario de lo que afirma la verificación LSP. </w:t>
+            </w:r>
+            <w:r>
+              <w:t xml:space="preserve">Se </w:t>
+            </w:r>
+            <w:proofErr w:type="spellStart"/>
+            <w:r>
+              <w:t>añadieron</w:t>
+            </w:r>
+            <w:proofErr w:type="spellEnd"/>
+            <w:r>
+              <w:t xml:space="preserve"> </w:t>
+            </w:r>
+            <w:proofErr w:type="spellStart"/>
+            <w:r>
+              <w:t>los</w:t>
+            </w:r>
+            <w:proofErr w:type="spellEnd"/>
+            <w:r>
+              <w:t xml:space="preserve"> </w:t>
+            </w:r>
+            <w:proofErr w:type="spellStart"/>
+            <w:r>
+              <w:t>miembros</w:t>
+            </w:r>
+            <w:proofErr w:type="spellEnd"/>
+            <w:r>
+              <w:t xml:space="preserve"> heredados bajo un separador explícito</w:t>
             </w:r>
           </w:p>
         </w:tc>
@@ -881,66 +1506,129 @@
       <w:tr>
         <w:tc>
           <w:tcPr>
-            <w:tcW w:w="1980" w:type="dxa"/>
-          </w:tcPr>
-          <w:p>
-            <w:pPr>
-              <w:pStyle w:val="Compact"/>
-            </w:pPr>
-            <w:r>
+            <w:tcW w:w="2263" w:type="dxa"/>
+          </w:tcPr>
+          <w:p>
+            <w:pPr>
+              <w:pStyle w:val="Compact"/>
+            </w:pPr>
+            <w:r>
+              <w:t>10</w:t>
+            </w:r>
+          </w:p>
+        </w:tc>
+        <w:tc>
+          <w:tcPr>
+            <w:tcW w:w="2263" w:type="dxa"/>
+          </w:tcPr>
+          <w:p>
+            <w:pPr>
+              <w:pStyle w:val="Compact"/>
+              <w:rPr>
+                <w:lang w:val="es-CO"/>
+              </w:rPr>
+            </w:pPr>
+            <w:r>
+              <w:rPr>
+                <w:lang w:val="es-CO"/>
+              </w:rPr>
+              <w:t xml:space="preserve">Reconstruir el </w:t>
+            </w:r>
+            <w:r>
+              <w:rPr>
+                <w:lang w:val="es-CO"/>
+              </w:rPr>
               <w:lastRenderedPageBreak/>
-              <w:t>10</w:t>
-            </w:r>
-          </w:p>
-        </w:tc>
-        <w:tc>
-          <w:tcPr>
-            <w:tcW w:w="1980" w:type="dxa"/>
-          </w:tcPr>
-          <w:p>
-            <w:pPr>
-              <w:pStyle w:val="Compact"/>
-            </w:pPr>
-            <w:r>
-              <w:t>Reconstruir el diagrama TO-BE desde cero</w:t>
-            </w:r>
-          </w:p>
-        </w:tc>
-        <w:tc>
-          <w:tcPr>
-            <w:tcW w:w="1980" w:type="dxa"/>
-          </w:tcPr>
-          <w:p>
-            <w:pPr>
-              <w:pStyle w:val="Compact"/>
-            </w:pPr>
+              <w:t>diagrama TO-BE desde cero</w:t>
+            </w:r>
+          </w:p>
+        </w:tc>
+        <w:tc>
+          <w:tcPr>
+            <w:tcW w:w="2264" w:type="dxa"/>
+          </w:tcPr>
+          <w:p>
+            <w:pPr>
+              <w:pStyle w:val="Compact"/>
+            </w:pPr>
+            <w:proofErr w:type="spellStart"/>
             <w:r>
               <w:rPr>
                 <w:b/>
                 <w:bCs/>
               </w:rPr>
+              <w:lastRenderedPageBreak/>
               <w:t>Corregido</w:t>
             </w:r>
-          </w:p>
-        </w:tc>
-        <w:tc>
-          <w:tcPr>
-            <w:tcW w:w="1980" w:type="dxa"/>
-          </w:tcPr>
-          <w:p>
-            <w:pPr>
-              <w:pStyle w:val="Compact"/>
-            </w:pPr>
-            <w:r>
-              <w:t xml:space="preserve">Reconstruir a mano introdujo tres errores: atributos incompletos, enums olvidados y código muerto ausente. Se cambió el método: transformar el </w:t>
-            </w:r>
-            <w:r>
-              <w:rPr>
-                <w:rStyle w:val="VerbatimChar"/>
-              </w:rPr>
-              <w:t>.drawio</w:t>
-            </w:r>
-            <w:r>
+            <w:proofErr w:type="spellEnd"/>
+          </w:p>
+        </w:tc>
+        <w:tc>
+          <w:tcPr>
+            <w:tcW w:w="2264" w:type="dxa"/>
+          </w:tcPr>
+          <w:p>
+            <w:pPr>
+              <w:pStyle w:val="Compact"/>
+              <w:rPr>
+                <w:lang w:val="es-CO"/>
+              </w:rPr>
+            </w:pPr>
+            <w:r>
+              <w:rPr>
+                <w:lang w:val="es-CO"/>
+              </w:rPr>
+              <w:t xml:space="preserve">Reconstruir a mano </w:t>
+            </w:r>
+            <w:r>
+              <w:rPr>
+                <w:lang w:val="es-CO"/>
+              </w:rPr>
+              <w:lastRenderedPageBreak/>
+              <w:t xml:space="preserve">introdujo tres errores: atributos incompletos, </w:t>
+            </w:r>
+            <w:proofErr w:type="spellStart"/>
+            <w:r>
+              <w:rPr>
+                <w:lang w:val="es-CO"/>
+              </w:rPr>
+              <w:t>enums</w:t>
+            </w:r>
+            <w:proofErr w:type="spellEnd"/>
+            <w:r>
+              <w:rPr>
+                <w:lang w:val="es-CO"/>
+              </w:rPr>
+              <w:t xml:space="preserve"> olvidados y código muerto ausente. Se cambió el método: transformar </w:t>
+            </w:r>
+            <w:proofErr w:type="gramStart"/>
+            <w:r>
+              <w:rPr>
+                <w:lang w:val="es-CO"/>
+              </w:rPr>
+              <w:t xml:space="preserve">el </w:t>
+            </w:r>
+            <w:r>
+              <w:rPr>
+                <w:rStyle w:val="VerbatimChar"/>
+                <w:lang w:val="es-CO"/>
+              </w:rPr>
+              <w:t>.</w:t>
+            </w:r>
+            <w:proofErr w:type="spellStart"/>
+            <w:r>
+              <w:rPr>
+                <w:rStyle w:val="VerbatimChar"/>
+                <w:lang w:val="es-CO"/>
+              </w:rPr>
+              <w:t>drawio</w:t>
+            </w:r>
+            <w:proofErr w:type="spellEnd"/>
+            <w:proofErr w:type="gramEnd"/>
+            <w:r>
+              <w:rPr>
+                <w:lang w:val="es-CO"/>
+              </w:rPr>
               <w:t xml:space="preserve"> del AS-IS conservando cada caja en su posición. Así lo conservado es literalmente la misma caja y los dos diagramas se comparan lado a lado</w:t>
             </w:r>
           </w:p>
@@ -949,38 +1637,68 @@
       <w:tr>
         <w:tc>
           <w:tcPr>
-            <w:tcW w:w="1980" w:type="dxa"/>
-          </w:tcPr>
-          <w:p>
-            <w:pPr>
-              <w:pStyle w:val="Compact"/>
-            </w:pPr>
-            <w:r>
+            <w:tcW w:w="2263" w:type="dxa"/>
+          </w:tcPr>
+          <w:p>
+            <w:pPr>
+              <w:pStyle w:val="Compact"/>
+            </w:pPr>
+            <w:r>
+              <w:lastRenderedPageBreak/>
               <w:t>11</w:t>
             </w:r>
           </w:p>
         </w:tc>
         <w:tc>
           <w:tcPr>
-            <w:tcW w:w="1980" w:type="dxa"/>
-          </w:tcPr>
-          <w:p>
-            <w:pPr>
-              <w:pStyle w:val="Compact"/>
-            </w:pPr>
-            <w:r>
-              <w:t>Selector de creadores por clave resuelto en el composition root</w:t>
-            </w:r>
-          </w:p>
-        </w:tc>
-        <w:tc>
-          <w:tcPr>
-            <w:tcW w:w="1980" w:type="dxa"/>
-          </w:tcPr>
-          <w:p>
-            <w:pPr>
-              <w:pStyle w:val="Compact"/>
-            </w:pPr>
+            <w:tcW w:w="2263" w:type="dxa"/>
+          </w:tcPr>
+          <w:p>
+            <w:pPr>
+              <w:pStyle w:val="Compact"/>
+              <w:rPr>
+                <w:lang w:val="es-CO"/>
+              </w:rPr>
+            </w:pPr>
+            <w:r>
+              <w:rPr>
+                <w:lang w:val="es-CO"/>
+              </w:rPr>
+              <w:t xml:space="preserve">Selector de creadores por clave resuelto en el </w:t>
+            </w:r>
+            <w:proofErr w:type="spellStart"/>
+            <w:r>
+              <w:rPr>
+                <w:lang w:val="es-CO"/>
+              </w:rPr>
+              <w:t>composition</w:t>
+            </w:r>
+            <w:proofErr w:type="spellEnd"/>
+            <w:r>
+              <w:rPr>
+                <w:lang w:val="es-CO"/>
+              </w:rPr>
+              <w:t xml:space="preserve"> </w:t>
+            </w:r>
+            <w:proofErr w:type="spellStart"/>
+            <w:r>
+              <w:rPr>
+                <w:lang w:val="es-CO"/>
+              </w:rPr>
+              <w:t>root</w:t>
+            </w:r>
+            <w:proofErr w:type="spellEnd"/>
+          </w:p>
+        </w:tc>
+        <w:tc>
+          <w:tcPr>
+            <w:tcW w:w="2264" w:type="dxa"/>
+          </w:tcPr>
+          <w:p>
+            <w:pPr>
+              <w:pStyle w:val="Compact"/>
+            </w:pPr>
+            <w:proofErr w:type="spellStart"/>
             <w:r>
               <w:rPr>
                 <w:b/>
@@ -988,18 +1706,25 @@
               </w:rPr>
               <w:t>Aceptado</w:t>
             </w:r>
-          </w:p>
-        </w:tc>
-        <w:tc>
-          <w:tcPr>
-            <w:tcW w:w="1980" w:type="dxa"/>
-          </w:tcPr>
-          <w:p>
-            <w:pPr>
-              <w:pStyle w:val="Compact"/>
-            </w:pPr>
-            <w:r>
-              <w:t>Es la única alternativa donde agregar un tipo no modifica ninguna clase: una clase de dominio, un creador y una línea de registro. Se aceptó el costo de una indirección más y de que un tipo mal escrito falle en ejecución. Es ADR-006</w:t>
+            <w:proofErr w:type="spellEnd"/>
+          </w:p>
+        </w:tc>
+        <w:tc>
+          <w:tcPr>
+            <w:tcW w:w="2264" w:type="dxa"/>
+          </w:tcPr>
+          <w:p>
+            <w:pPr>
+              <w:pStyle w:val="Compact"/>
+            </w:pPr>
+            <w:r>
+              <w:rPr>
+                <w:lang w:val="es-CO"/>
+              </w:rPr>
+              <w:t xml:space="preserve">Es la única alternativa donde agregar un tipo no modifica ninguna clase: una clase de dominio, un creador y una línea de registro. Se aceptó el costo de una indirección más y de que un tipo mal escrito falle en ejecución. </w:t>
+            </w:r>
+            <w:r>
+              <w:t>Es ADR-006</w:t>
             </w:r>
           </w:p>
         </w:tc>
@@ -1007,7 +1732,7 @@
       <w:tr>
         <w:tc>
           <w:tcPr>
-            <w:tcW w:w="1980" w:type="dxa"/>
+            <w:tcW w:w="2263" w:type="dxa"/>
           </w:tcPr>
           <w:p>
             <w:pPr>
@@ -1020,34 +1745,62 @@
         </w:tc>
         <w:tc>
           <w:tcPr>
-            <w:tcW w:w="1980" w:type="dxa"/>
-          </w:tcPr>
-          <w:p>
-            <w:pPr>
-              <w:pStyle w:val="Compact"/>
-            </w:pPr>
-            <w:r>
+            <w:tcW w:w="2263" w:type="dxa"/>
+          </w:tcPr>
+          <w:p>
+            <w:pPr>
+              <w:pStyle w:val="Compact"/>
+              <w:rPr>
+                <w:lang w:val="es-CO"/>
+              </w:rPr>
+            </w:pPr>
+            <w:r>
+              <w:rPr>
+                <w:lang w:val="es-CO"/>
+              </w:rPr>
               <w:t xml:space="preserve">Tres interfaces de carga de una operación cada una en lugar de una </w:t>
             </w:r>
-            <w:r>
-              <w:rPr>
-                <w:rStyle w:val="VerbatimChar"/>
+            <w:proofErr w:type="spellStart"/>
+            <w:r>
+              <w:rPr>
+                <w:rStyle w:val="VerbatimChar"/>
+                <w:lang w:val="es-CO"/>
               </w:rPr>
               <w:t>ICargador</w:t>
             </w:r>
-            <w:r>
+            <w:proofErr w:type="spellEnd"/>
+            <w:r>
+              <w:rPr>
+                <w:lang w:val="es-CO"/>
+              </w:rPr>
               <w:t xml:space="preserve"> general</w:t>
             </w:r>
           </w:p>
-        </w:tc>
-        <w:tc>
-          <w:tcPr>
-            <w:tcW w:w="1980" w:type="dxa"/>
-          </w:tcPr>
-          <w:p>
-            <w:pPr>
-              <w:pStyle w:val="Compact"/>
-            </w:pPr>
+          <w:p>
+            <w:pPr>
+              <w:rPr>
+                <w:lang w:val="es-CO"/>
+              </w:rPr>
+            </w:pPr>
+          </w:p>
+          <w:p>
+            <w:pPr>
+              <w:jc w:val="right"/>
+              <w:rPr>
+                <w:lang w:val="es-CO"/>
+              </w:rPr>
+            </w:pPr>
+          </w:p>
+        </w:tc>
+        <w:tc>
+          <w:tcPr>
+            <w:tcW w:w="2264" w:type="dxa"/>
+          </w:tcPr>
+          <w:p>
+            <w:pPr>
+              <w:pStyle w:val="Compact"/>
+            </w:pPr>
+            <w:proofErr w:type="spellStart"/>
             <w:r>
               <w:rPr>
                 <w:b/>
@@ -1055,28 +1808,429 @@
               </w:rPr>
               <w:t>Aceptado</w:t>
             </w:r>
-          </w:p>
-        </w:tc>
-        <w:tc>
-          <w:tcPr>
-            <w:tcW w:w="1980" w:type="dxa"/>
-          </w:tcPr>
-          <w:p>
-            <w:pPr>
-              <w:pStyle w:val="Compact"/>
-            </w:pPr>
-            <w:r>
-              <w:rPr>
-                <w:rStyle w:val="VerbatimChar"/>
+            <w:proofErr w:type="spellEnd"/>
+          </w:p>
+        </w:tc>
+        <w:tc>
+          <w:tcPr>
+            <w:tcW w:w="2264" w:type="dxa"/>
+          </w:tcPr>
+          <w:p>
+            <w:pPr>
+              <w:pStyle w:val="Compact"/>
+              <w:rPr>
+                <w:lang w:val="es-CO"/>
+              </w:rPr>
+            </w:pPr>
+            <w:proofErr w:type="spellStart"/>
+            <w:r>
+              <w:rPr>
+                <w:rStyle w:val="VerbatimChar"/>
+                <w:lang w:val="es-CO"/>
               </w:rPr>
               <w:t>ServicioUsuario</w:t>
             </w:r>
-            <w:r>
-              <w:t xml:space="preserve"> no tiene por qué conocer cómo se cargan los productos. Cada servicio depende solo de la capacidad que usa. </w:t>
-            </w:r>
-            <w:r>
+            <w:proofErr w:type="spellEnd"/>
+            <w:r>
+              <w:rPr>
+                <w:lang w:val="es-CO"/>
+              </w:rPr>
+              <w:t xml:space="preserve"> no tiene por qué conocer cómo se cargan los productos. Cada servicio depende solo de la capacidad que usa. Es la aplicación de</w:t>
+            </w:r>
+            <w:r>
+              <w:rPr>
+                <w:lang w:val="es-CO"/>
+              </w:rPr>
+              <w:t>l</w:t>
+            </w:r>
+            <w:r>
+              <w:rPr>
+                <w:lang w:val="es-CO"/>
+              </w:rPr>
+              <w:t xml:space="preserve"> </w:t>
+            </w:r>
+            <w:r>
+              <w:rPr>
+                <w:lang w:val="es-CO"/>
+              </w:rPr>
               <w:lastRenderedPageBreak/>
-              <w:t>Es la aplicación de ISP en ADR-002</w:t>
+              <w:t>ISP en ADR-002</w:t>
+            </w:r>
+          </w:p>
+        </w:tc>
+      </w:tr>
+      <w:tr>
+        <w:tc>
+          <w:tcPr>
+            <w:tcW w:w="2263" w:type="dxa"/>
+          </w:tcPr>
+          <w:p>
+            <w:pPr>
+              <w:pStyle w:val="Compact"/>
+            </w:pPr>
+            <w:r>
+              <w:lastRenderedPageBreak/>
+              <w:t>13</w:t>
+            </w:r>
+          </w:p>
+        </w:tc>
+        <w:tc>
+          <w:tcPr>
+            <w:tcW w:w="2263" w:type="dxa"/>
+          </w:tcPr>
+          <w:p>
+            <w:pPr>
+              <w:pStyle w:val="Compact"/>
+              <w:rPr>
+                <w:lang w:val="es-CO"/>
+              </w:rPr>
+            </w:pPr>
+            <w:r>
+              <w:rPr>
+                <w:lang w:val="es-CO"/>
+              </w:rPr>
+              <w:t xml:space="preserve">Categorizar eventos como bajo nivel en mapa de dependencias </w:t>
+            </w:r>
+          </w:p>
+        </w:tc>
+        <w:tc>
+          <w:tcPr>
+            <w:tcW w:w="2264" w:type="dxa"/>
+          </w:tcPr>
+          <w:p>
+            <w:pPr>
+              <w:pStyle w:val="Compact"/>
+              <w:rPr>
+                <w:b/>
+                <w:bCs/>
+                <w:lang w:val="es-CO"/>
+              </w:rPr>
+            </w:pPr>
+            <w:r>
+              <w:rPr>
+                <w:b/>
+                <w:bCs/>
+                <w:lang w:val="es-CO"/>
+              </w:rPr>
+              <w:t>Rechaza</w:t>
+            </w:r>
+            <w:r>
+              <w:rPr>
+                <w:b/>
+                <w:bCs/>
+                <w:lang w:val="es-CO"/>
+              </w:rPr>
+              <w:t>do</w:t>
+            </w:r>
+          </w:p>
+        </w:tc>
+        <w:tc>
+          <w:tcPr>
+            <w:tcW w:w="2264" w:type="dxa"/>
+          </w:tcPr>
+          <w:p>
+            <w:pPr>
+              <w:pStyle w:val="Compact"/>
+              <w:rPr>
+                <w:rStyle w:val="VerbatimChar"/>
+                <w:lang w:val="es-CO"/>
+              </w:rPr>
+            </w:pPr>
+            <w:r>
+              <w:rPr>
+                <w:rStyle w:val="VerbatimChar"/>
+                <w:lang w:val="es-CO"/>
+              </w:rPr>
+              <w:t xml:space="preserve">Al diseñar el </w:t>
+            </w:r>
+            <w:r>
+              <w:rPr>
+                <w:rStyle w:val="VerbatimChar"/>
+                <w:lang w:val="es-CO"/>
+              </w:rPr>
+              <w:t>mapa, dudamos acerca de la categoría de los eventos</w:t>
+            </w:r>
+            <w:r>
+              <w:rPr>
+                <w:rStyle w:val="VerbatimChar"/>
+                <w:lang w:val="es-CO"/>
+              </w:rPr>
+              <w:t xml:space="preserve"> y utilizamos inteligencia artificial para aclarar la duda, sin </w:t>
+            </w:r>
+            <w:proofErr w:type="gramStart"/>
+            <w:r>
+              <w:rPr>
+                <w:rStyle w:val="VerbatimChar"/>
+                <w:lang w:val="es-CO"/>
+              </w:rPr>
+              <w:t>embargo</w:t>
+            </w:r>
+            <w:proofErr w:type="gramEnd"/>
+            <w:r>
+              <w:rPr>
+                <w:rStyle w:val="VerbatimChar"/>
+                <w:lang w:val="es-CO"/>
+              </w:rPr>
+              <w:t xml:space="preserve"> </w:t>
+            </w:r>
+            <w:r>
+              <w:rPr>
+                <w:rStyle w:val="VerbatimChar"/>
+                <w:lang w:val="es-CO"/>
+              </w:rPr>
+              <w:t xml:space="preserve">decidimos </w:t>
+            </w:r>
+            <w:r>
+              <w:rPr>
+                <w:rStyle w:val="VerbatimChar"/>
+                <w:lang w:val="es-CO"/>
+              </w:rPr>
+              <w:t xml:space="preserve">revisar de nuevo el proyecto y concluimos </w:t>
+            </w:r>
+            <w:r>
+              <w:rPr>
+                <w:rStyle w:val="VerbatimChar"/>
+                <w:lang w:val="es-CO"/>
+              </w:rPr>
+              <w:t>que l</w:t>
+            </w:r>
+            <w:r>
+              <w:rPr>
+                <w:rStyle w:val="VerbatimChar"/>
+                <w:lang w:val="es-CO"/>
+              </w:rPr>
+              <w:t>os eventos son de bajo nivel porque no contienen regla</w:t>
+            </w:r>
+            <w:r>
+              <w:rPr>
+                <w:rStyle w:val="VerbatimChar"/>
+                <w:lang w:val="es-CO"/>
+              </w:rPr>
+              <w:t>s</w:t>
+            </w:r>
+            <w:r>
+              <w:rPr>
+                <w:rStyle w:val="VerbatimChar"/>
+                <w:lang w:val="es-CO"/>
+              </w:rPr>
+              <w:t xml:space="preserve"> de negocio</w:t>
+            </w:r>
+            <w:r>
+              <w:rPr>
+                <w:rStyle w:val="VerbatimChar"/>
+                <w:lang w:val="es-CO"/>
+              </w:rPr>
+              <w:t>,</w:t>
+            </w:r>
+            <w:r>
+              <w:rPr>
+                <w:rStyle w:val="VerbatimChar"/>
+                <w:lang w:val="es-CO"/>
+              </w:rPr>
+              <w:t xml:space="preserve"> solo transmiten una decisión </w:t>
+            </w:r>
+            <w:r>
+              <w:rPr>
+                <w:rStyle w:val="VerbatimChar"/>
+                <w:lang w:val="es-CO"/>
+              </w:rPr>
+              <w:t xml:space="preserve">que </w:t>
+            </w:r>
+            <w:r>
+              <w:rPr>
+                <w:rStyle w:val="VerbatimChar"/>
+                <w:lang w:val="es-CO"/>
+              </w:rPr>
+              <w:t xml:space="preserve">ya </w:t>
+            </w:r>
+            <w:r>
+              <w:rPr>
+                <w:rStyle w:val="VerbatimChar"/>
+                <w:lang w:val="es-CO"/>
+              </w:rPr>
+              <w:t xml:space="preserve">fue </w:t>
+            </w:r>
+            <w:r>
+              <w:rPr>
+                <w:rStyle w:val="VerbatimChar"/>
+                <w:lang w:val="es-CO"/>
+              </w:rPr>
+              <w:t xml:space="preserve">tomada por el servicio </w:t>
+            </w:r>
+            <w:r>
+              <w:rPr>
+                <w:rStyle w:val="VerbatimChar"/>
+                <w:lang w:val="es-CO"/>
+              </w:rPr>
+              <w:t xml:space="preserve">antes de invocarlos, esa transmisión pasa hacia </w:t>
+            </w:r>
+            <w:proofErr w:type="spellStart"/>
+            <w:r>
+              <w:rPr>
+                <w:rStyle w:val="VerbatimChar"/>
+                <w:lang w:val="es-CO"/>
+              </w:rPr>
+              <w:t>Program.cs</w:t>
+            </w:r>
+            <w:proofErr w:type="spellEnd"/>
+            <w:r>
+              <w:rPr>
+                <w:rStyle w:val="VerbatimChar"/>
+                <w:lang w:val="es-CO"/>
+              </w:rPr>
+              <w:t xml:space="preserve"> que es donde se </w:t>
+            </w:r>
+            <w:r>
+              <w:rPr>
+                <w:rStyle w:val="VerbatimChar"/>
+                <w:lang w:val="es-CO"/>
+              </w:rPr>
+              <w:t>esc</w:t>
+            </w:r>
+            <w:r>
+              <w:rPr>
+                <w:rStyle w:val="VerbatimChar"/>
+                <w:lang w:val="es-CO"/>
+              </w:rPr>
+              <w:t>ribe a</w:t>
+            </w:r>
+            <w:r>
+              <w:rPr>
+                <w:rStyle w:val="VerbatimChar"/>
+                <w:lang w:val="es-CO"/>
+              </w:rPr>
+              <w:t xml:space="preserve"> </w:t>
+            </w:r>
+            <w:proofErr w:type="spellStart"/>
+            <w:r>
+              <w:rPr>
+                <w:rStyle w:val="VerbatimChar"/>
+                <w:lang w:val="es-CO"/>
+              </w:rPr>
+              <w:t>Console</w:t>
+            </w:r>
+            <w:proofErr w:type="spellEnd"/>
+            <w:r>
+              <w:rPr>
+                <w:rStyle w:val="VerbatimChar"/>
+                <w:lang w:val="es-CO"/>
+              </w:rPr>
+              <w:t xml:space="preserve">. </w:t>
+            </w:r>
+            <w:r>
+              <w:rPr>
+                <w:rStyle w:val="VerbatimChar"/>
+                <w:lang w:val="es-CO"/>
+              </w:rPr>
+              <w:t xml:space="preserve">También </w:t>
+            </w:r>
+            <w:r>
+              <w:rPr>
+                <w:rStyle w:val="VerbatimChar"/>
+                <w:lang w:val="es-CO"/>
+              </w:rPr>
+              <w:t>identificamos</w:t>
+            </w:r>
+            <w:r>
+              <w:rPr>
+                <w:rStyle w:val="VerbatimChar"/>
+                <w:lang w:val="es-CO"/>
+              </w:rPr>
+              <w:t xml:space="preserve"> que </w:t>
+            </w:r>
+            <w:r>
+              <w:rPr>
+                <w:rStyle w:val="VerbatimChar"/>
+                <w:lang w:val="es-CO"/>
+              </w:rPr>
+              <w:t xml:space="preserve">son el único mecanismo del sistema que evita que un servicio de alto nivel llame directamente a </w:t>
+            </w:r>
+            <w:proofErr w:type="spellStart"/>
+            <w:r>
+              <w:rPr>
+                <w:rStyle w:val="VerbatimChar"/>
+                <w:lang w:val="es-CO"/>
+              </w:rPr>
+              <w:t>Console</w:t>
+            </w:r>
+            <w:proofErr w:type="spellEnd"/>
+            <w:r>
+              <w:rPr>
+                <w:rStyle w:val="VerbatimChar"/>
+                <w:lang w:val="es-CO"/>
+              </w:rPr>
+              <w:t xml:space="preserve">, pero </w:t>
+            </w:r>
+            <w:r>
+              <w:rPr>
+                <w:rStyle w:val="VerbatimChar"/>
+                <w:lang w:val="es-CO"/>
+              </w:rPr>
+              <w:t>como esa relación se da entre tipos concretos y no</w:t>
+            </w:r>
+            <w:r>
+              <w:rPr>
+                <w:rStyle w:val="VerbatimChar"/>
+                <w:lang w:val="es-CO"/>
+              </w:rPr>
+              <w:t xml:space="preserve"> por </w:t>
+            </w:r>
+            <w:r>
+              <w:rPr>
+                <w:rStyle w:val="VerbatimChar"/>
+                <w:lang w:val="es-CO"/>
+              </w:rPr>
+              <w:t>una abstracción, no constituye</w:t>
+            </w:r>
+            <w:r>
+              <w:rPr>
+                <w:rStyle w:val="VerbatimChar"/>
+                <w:lang w:val="es-CO"/>
+              </w:rPr>
+              <w:t xml:space="preserve"> como </w:t>
+            </w:r>
+            <w:r>
+              <w:rPr>
+                <w:rStyle w:val="VerbatimChar"/>
+                <w:lang w:val="es-CO"/>
+              </w:rPr>
+              <w:lastRenderedPageBreak/>
+              <w:t>tal</w:t>
+            </w:r>
+            <w:r>
+              <w:rPr>
+                <w:rStyle w:val="VerbatimChar"/>
+                <w:lang w:val="es-CO"/>
+              </w:rPr>
+              <w:t xml:space="preserve"> una inversión de dependencias, </w:t>
+            </w:r>
+            <w:r>
+              <w:rPr>
+                <w:rStyle w:val="VerbatimChar"/>
+                <w:lang w:val="es-CO"/>
+              </w:rPr>
+              <w:t>sino más bien</w:t>
+            </w:r>
+            <w:r>
+              <w:rPr>
+                <w:rStyle w:val="VerbatimChar"/>
+                <w:lang w:val="es-CO"/>
+              </w:rPr>
+              <w:t xml:space="preserve"> un desacoplamiento</w:t>
+            </w:r>
+            <w:r>
+              <w:rPr>
+                <w:rStyle w:val="VerbatimChar"/>
+                <w:lang w:val="es-CO"/>
+              </w:rPr>
+              <w:t xml:space="preserve"> de mecanismo, no de abstracción</w:t>
+            </w:r>
+            <w:r>
+              <w:rPr>
+                <w:rStyle w:val="VerbatimChar"/>
+                <w:lang w:val="es-CO"/>
+              </w:rPr>
+              <w:t>.</w:t>
             </w:r>
           </w:p>
         </w:tc>
@@ -1084,13 +2238,29 @@
     </w:tbl>
     <w:p>
       <w:pPr>
-        <w:pStyle w:val="Ttulo2"/>
+        <w:pStyle w:val="Textoindependiente"/>
+        <w:rPr>
+          <w:b/>
+          <w:bCs/>
+          <w:color w:val="0F9ED5" w:themeColor="accent4"/>
+          <w:sz w:val="32"/>
+          <w:szCs w:val="32"/>
+          <w:lang w:val="es-CO"/>
+        </w:rPr>
       </w:pPr>
       <w:bookmarkStart w:id="3" w:name="t2.-balance-de-decisiones"/>
       <w:bookmarkEnd w:id="2"/>
       <w:r>
+        <w:rPr>
+          <w:b/>
+          <w:bCs/>
+          <w:color w:val="0F9ED5" w:themeColor="accent4"/>
+          <w:sz w:val="32"/>
+          <w:szCs w:val="32"/>
+          <w:lang w:val="es-CO"/>
+        </w:rPr>
         <w:lastRenderedPageBreak/>
-        <w:t>T2. Balance de decisiones</w:t>
+        <w:t>Balance de decisiones</w:t>
       </w:r>
     </w:p>
     <w:tbl>
@@ -1218,11 +2388,7 @@
               <w:pStyle w:val="Compact"/>
             </w:pPr>
             <w:r>
-              <w:rPr>
-                <w:b/>
-                <w:bCs/>
-              </w:rPr>
-              <w:t>7</w:t>
+              <w:t>8</w:t>
             </w:r>
           </w:p>
         </w:tc>
@@ -1230,29 +2396,68 @@
     </w:tbl>
     <w:p>
       <w:pPr>
-        <w:pStyle w:val="Ttulo2"/>
+        <w:pStyle w:val="FirstParagraph"/>
+        <w:rPr>
+          <w:b/>
+          <w:bCs/>
+          <w:color w:val="0F9ED5" w:themeColor="accent4"/>
+          <w:sz w:val="28"/>
+          <w:szCs w:val="28"/>
+          <w:lang w:val="es-CO"/>
+        </w:rPr>
       </w:pPr>
       <w:bookmarkStart w:id="4" w:name="el-límite-deliberado-al-rediseño"/>
       <w:bookmarkEnd w:id="3"/>
+    </w:p>
+    <w:p>
+      <w:pPr>
+        <w:pStyle w:val="Textoindependiente"/>
+        <w:rPr>
+          <w:b/>
+          <w:bCs/>
+          <w:color w:val="0F9ED5" w:themeColor="accent4"/>
+          <w:sz w:val="32"/>
+          <w:szCs w:val="32"/>
+          <w:lang w:val="es-CO"/>
+        </w:rPr>
+      </w:pPr>
       <w:r>
-        <w:t>El límite deliberado al rediseño</w:t>
+        <w:rPr>
+          <w:b/>
+          <w:bCs/>
+          <w:color w:val="0F9ED5" w:themeColor="accent4"/>
+          <w:sz w:val="32"/>
+          <w:szCs w:val="32"/>
+          <w:lang w:val="es-CO"/>
+        </w:rPr>
+        <w:t xml:space="preserve">El límite deliberado al rediseño </w:t>
       </w:r>
     </w:p>
     <w:p>
       <w:pPr>
         <w:pStyle w:val="FirstParagraph"/>
+        <w:rPr>
+          <w:lang w:val="es-CO"/>
+        </w:rPr>
       </w:pPr>
       <w:r>
+        <w:rPr>
+          <w:lang w:val="es-CO"/>
+        </w:rPr>
         <w:t xml:space="preserve">Tres cosas que la herramienta propuso y el equipo decidió </w:t>
       </w:r>
       <w:r>
         <w:rPr>
           <w:b/>
           <w:bCs/>
+          <w:lang w:val="es-CO"/>
         </w:rPr>
         <w:t>no</w:t>
       </w:r>
       <w:r>
+        <w:rPr>
+          <w:lang w:val="es-CO"/>
+        </w:rPr>
         <w:t xml:space="preserve"> hacer, no por falta de tiempo sino por criterio:</w:t>
       </w:r>
     </w:p>
@@ -1263,15 +2468,22 @@
           <w:ilvl w:val="0"/>
           <w:numId w:val="2"/>
         </w:numPr>
+        <w:rPr>
+          <w:lang w:val="es-CO"/>
+        </w:rPr>
       </w:pPr>
       <w:r>
         <w:rPr>
           <w:b/>
           <w:bCs/>
+          <w:lang w:val="es-CO"/>
         </w:rPr>
         <w:t>No corregir el stock negativo</w:t>
       </w:r>
       <w:r>
+        <w:rPr>
+          <w:lang w:val="es-CO"/>
+        </w:rPr>
         <w:t xml:space="preserve"> (H-07), aunque es un defecto real: la restricción dura lo prohíbe.</w:t>
       </w:r>
     </w:p>
@@ -1282,15 +2494,22 @@
           <w:ilvl w:val="0"/>
           <w:numId w:val="2"/>
         </w:numPr>
+        <w:rPr>
+          <w:lang w:val="es-CO"/>
+        </w:rPr>
       </w:pPr>
       <w:r>
         <w:rPr>
           <w:b/>
           <w:bCs/>
+          <w:lang w:val="es-CO"/>
         </w:rPr>
         <w:t>No eliminar el código muerto</w:t>
       </w:r>
       <w:r>
+        <w:rPr>
+          <w:lang w:val="es-CO"/>
+        </w:rPr>
         <w:t xml:space="preserve"> (H-08): ningún punto de dolor lo exige.</w:t>
       </w:r>
     </w:p>
@@ -1301,65 +2520,109 @@
           <w:ilvl w:val="0"/>
           <w:numId w:val="2"/>
         </w:numPr>
+        <w:rPr>
+          <w:lang w:val="es-CO"/>
+        </w:rPr>
       </w:pPr>
       <w:r>
         <w:rPr>
           <w:b/>
           <w:bCs/>
+          <w:lang w:val="es-CO"/>
         </w:rPr>
         <w:t xml:space="preserve">No introducir interfaces para </w:t>
       </w:r>
+      <w:proofErr w:type="spellStart"/>
       <w:r>
         <w:rPr>
           <w:rStyle w:val="VerbatimChar"/>
           <w:b/>
           <w:bCs/>
+          <w:lang w:val="es-CO"/>
         </w:rPr>
         <w:t>ServicioVenta</w:t>
       </w:r>
+      <w:proofErr w:type="spellEnd"/>
       <w:r>
         <w:rPr>
           <w:b/>
           <w:bCs/>
+          <w:lang w:val="es-CO"/>
         </w:rPr>
         <w:t xml:space="preserve">, </w:t>
       </w:r>
+      <w:proofErr w:type="spellStart"/>
       <w:r>
         <w:rPr>
           <w:rStyle w:val="VerbatimChar"/>
           <w:b/>
           <w:bCs/>
+          <w:lang w:val="es-CO"/>
         </w:rPr>
         <w:t>ServicioFidelizacion</w:t>
       </w:r>
+      <w:proofErr w:type="spellEnd"/>
       <w:r>
         <w:rPr>
           <w:b/>
           <w:bCs/>
+          <w:lang w:val="es-CO"/>
         </w:rPr>
         <w:t xml:space="preserve"> ni </w:t>
       </w:r>
+      <w:proofErr w:type="spellStart"/>
       <w:r>
         <w:rPr>
           <w:rStyle w:val="VerbatimChar"/>
           <w:b/>
           <w:bCs/>
+          <w:lang w:val="es-CO"/>
         </w:rPr>
         <w:t>ServicioMonitoreoProductos</w:t>
       </w:r>
+      <w:proofErr w:type="spellEnd"/>
       <w:r>
-        <w:t>: tienen una sola implementación y no hay ninguna solicitud de cambio que pida variarlas. Una interfaz con una sola implementación es sobre-ingeniería, no diseño.</w:t>
+        <w:rPr>
+          <w:lang w:val="es-CO"/>
+        </w:rPr>
+        <w:t xml:space="preserve">: tienen una sola implementación y no hay ninguna solicitud de cambio que pida variarlas. Una interfaz con una sola implementación es </w:t>
+      </w:r>
+      <w:proofErr w:type="spellStart"/>
+      <w:r>
+        <w:rPr>
+          <w:lang w:val="es-CO"/>
+        </w:rPr>
+        <w:t>sobre-ingeniería</w:t>
+      </w:r>
+      <w:proofErr w:type="spellEnd"/>
+      <w:r>
+        <w:rPr>
+          <w:lang w:val="es-CO"/>
+        </w:rPr>
+        <w:t>, no diseño.</w:t>
       </w:r>
     </w:p>
     <w:p>
       <w:pPr>
         <w:pStyle w:val="FirstParagraph"/>
+        <w:rPr>
+          <w:lang w:val="es-CO"/>
+        </w:rPr>
       </w:pPr>
       <w:r>
-        <w:t>Los tres quedan documentados como deuda técnica consciente y se exponen en el video (minutos 17-20 del guion sugerido).</w:t>
+        <w:rPr>
+          <w:lang w:val="es-CO"/>
+        </w:rPr>
+        <w:t>Los tres quedan documentados como deuda técnica consciente y se exponen en el video</w:t>
       </w:r>
       <w:bookmarkEnd w:id="0"/>
       <w:bookmarkEnd w:id="4"/>
+      <w:r>
+        <w:rPr>
+          <w:lang w:val="es-CO"/>
+        </w:rPr>
+        <w:t>.</w:t>
+      </w:r>
     </w:p>
     <w:sectPr>
       <w:footnotePr>
@@ -1374,7 +2637,7 @@
 </file>
 
 <file path=word/numbering.xml><?xml version="1.0" encoding="utf-8"?>
-<w:numbering xmlns:wpc="http://schemas.microsoft.com/office/word/2010/wordprocessingCanvas" xmlns:cx="http://schemas.microsoft.com/office/drawing/2014/chartex" xmlns:cx1="http://schemas.microsoft.com/office/drawing/2015/9/8/chartex" xmlns:cx2="http://schemas.microsoft.com/office/drawing/2015/10/21/chartex" xmlns:cx3="http://schemas.microsoft.com/office/drawing/2016/5/9/chartex" xmlns:cx4="http://schemas.microsoft.com/office/drawing/2016/5/10/chartex" xmlns:cx5="http://schemas.microsoft.com/office/drawing/2016/5/11/chartex" xmlns:cx6="http://schemas.microsoft.com/office/drawing/2016/5/12/chartex" xmlns:cx7="http://schemas.microsoft.com/office/drawing/2016/5/13/chartex" xmlns:cx8="http://schemas.microsoft.com/office/drawing/2016/5/14/chartex" xmlns:mc="http://schemas.openxmlformats.org/markup-compatibility/2006" xmlns:aink="http://schemas.microsoft.com/office/drawing/2016/ink" xmlns:am3d="http://schemas.microsoft.com/office/drawing/2017/model3d" xmlns:o="urn:schemas-microsoft-com:office:office" xmlns:oel="http://schemas.microsoft.com/office/2019/extlst" xmlns:r="http://schemas.openxmlformats.org/officeDocument/2006/relationships" xmlns:m="http://schemas.openxmlformats.org/officeDocument/2006/math" xmlns:v="urn:schemas-microsoft-com:vml" xmlns:wp14="http://schemas.microsoft.com/office/word/2010/wordprocessingDrawing" xmlns:wp="http://schemas.openxmlformats.org/drawingml/2006/wordprocessingDrawing" xmlns:w10="urn:schemas-microsoft-com:office:word" xmlns:w="http://schemas.openxmlformats.org/wordprocessingml/2006/main" xmlns:w14="http://schemas.microsoft.com/office/word/2010/wordml" xmlns:w15="http://schemas.microsoft.com/office/word/2012/wordml" xmlns:w16cei="http://schemas.microsoft.com/office/word/2026/wordml/cei" xmlns:w16cex="http://schemas.microsoft.com/office/word/2018/wordml/cex" xmlns:w16cid="http://schemas.microsoft.com/office/word/2016/wordml/cid" xmlns:w16="http://schemas.microsoft.com/office/word/2018/wordml" xmlns:w16du="http://schemas.microsoft.com/office/word/2023/wordml/word16du" xmlns:w16sdtdh="http://schemas.microsoft.com/office/word/2020/wordml/sdtdatahash" xmlns:w16sdtfl="http://schemas.microsoft.com/office/word/2024/wordml/sdtformatlock" xmlns:w16se="http://schemas.microsoft.com/office/word/2015/wordml/symex" xmlns:wpg="http://schemas.microsoft.com/office/word/2010/wordprocessingGroup" xmlns:wpi="http://schemas.microsoft.com/office/word/2010/wordprocessingInk" xmlns:wne="http://schemas.microsoft.com/office/word/2006/wordml" xmlns:wps="http://schemas.microsoft.com/office/word/2010/wordprocessingShape" mc:Ignorable="w14 w15 w16se w16cid w16 w16cex w16sdtdh w16sdtfl w16du wp14">
+<w:numbering xmlns:wpc="http://schemas.microsoft.com/office/word/2010/wordprocessingCanvas" xmlns:cx="http://schemas.microsoft.com/office/drawing/2014/chartex" xmlns:cx1="http://schemas.microsoft.com/office/drawing/2015/9/8/chartex" xmlns:cx2="http://schemas.microsoft.com/office/drawing/2015/10/21/chartex" xmlns:cx3="http://schemas.microsoft.com/office/drawing/2016/5/9/chartex" xmlns:cx4="http://schemas.microsoft.com/office/drawing/2016/5/10/chartex" xmlns:cx5="http://schemas.microsoft.com/office/drawing/2016/5/11/chartex" xmlns:cx6="http://schemas.microsoft.com/office/drawing/2016/5/12/chartex" xmlns:cx7="http://schemas.microsoft.com/office/drawing/2016/5/13/chartex" xmlns:cx8="http://schemas.microsoft.com/office/drawing/2016/5/14/chartex" xmlns:mc="http://schemas.openxmlformats.org/markup-compatibility/2006" xmlns:aink="http://schemas.microsoft.com/office/drawing/2016/ink" xmlns:am3d="http://schemas.microsoft.com/office/drawing/2017/model3d" xmlns:o="urn:schemas-microsoft-com:office:office" xmlns:oel="http://schemas.microsoft.com/office/2019/extlst" xmlns:r="http://schemas.openxmlformats.org/officeDocument/2006/relationships" xmlns:m="http://schemas.openxmlformats.org/officeDocument/2006/math" xmlns:v="urn:schemas-microsoft-com:vml" xmlns:wp14="http://schemas.microsoft.com/office/word/2010/wordprocessingDrawing" xmlns:wp="http://schemas.openxmlformats.org/drawingml/2006/wordprocessingDrawing" xmlns:w10="urn:schemas-microsoft-com:office:word" xmlns:w="http://schemas.openxmlformats.org/wordprocessingml/2006/main" xmlns:w14="http://schemas.microsoft.com/office/word/2010/wordml" xmlns:w15="http://schemas.microsoft.com/office/word/2012/wordml" xmlns:w16cex="http://schemas.microsoft.com/office/word/2018/wordml/cex" xmlns:w16cid="http://schemas.microsoft.com/office/word/2016/wordml/cid" xmlns:w16="http://schemas.microsoft.com/office/word/2018/wordml" xmlns:w16du="http://schemas.microsoft.com/office/word/2023/wordml/word16du" xmlns:w16sdtdh="http://schemas.microsoft.com/office/word/2020/wordml/sdtdatahash" xmlns:w16sdtfl="http://schemas.microsoft.com/office/word/2024/wordml/sdtformatlock" xmlns:w16se="http://schemas.microsoft.com/office/word/2015/wordml/symex" xmlns:wpg="http://schemas.microsoft.com/office/word/2010/wordprocessingGroup" xmlns:wpi="http://schemas.microsoft.com/office/word/2010/wordprocessingInk" xmlns:wne="http://schemas.microsoft.com/office/word/2006/wordml" xmlns:wps="http://schemas.microsoft.com/office/word/2010/wordprocessingShape" mc:Ignorable="w14 w15 w16se w16cid w16 w16cex w16sdtdh w16sdtfl w16du wp14">
   <w:abstractNum w:abstractNumId="0" w15:restartNumberingAfterBreak="0">
     <w:nsid w:val="0000A990"/>
     <w:multiLevelType w:val="multilevel"/>

</xml_diff>